<commit_message>
v3.1.0 final: PCA/UMAP font sizes match volcano (FONT_SIZE=14). Pipeline order fixed (QC after DEG filter). Resumo expanded: concise title connecting transcriptomics + precision nursing, original keywords restored, italics formatting, no dashes. All QC plots regenerated.
</commit_message>
<xml_diff>
--- a/resumo_expandido_tireoide_2026.docx
+++ b/resumo_expandido_tireoide_2026.docx
@@ -17,13 +17,14 @@
       <w:r>
         <w:rPr>
           <w:rFonts w:ascii="Times New Roman" w:cs="Times New Roman" w:eastAsia="Times New Roman" w:hAnsi="Times New Roman"/>
-          <w:b w:val="1"/>
+          <w:b/>
           <w:bCs w:val="1"/>
-          <w:sz w:val="24"/>
-          <w:szCs w:val="24"/>
-          <w:rtl w:val="0"/>
-        </w:rPr>
-        <w:t>Alterações Transcriptômicas na Via de Sinalização dos Hormônios Tireoidianos no Carcinoma de Tireoide: Análise de Expressão Diferencial e Rede de Interação Proteína-Proteína com Potenciais Implicações Cardiovasculares</w:t>
+          <w:i w:val="0"/>
+          <w:sz w:val="24"/>
+          <w:szCs w:val="24"/>
+          <w:rtl w:val="0"/>
+        </w:rPr>
+        <w:t>Expressao Diferencial e Rede de Interacao Proteina-Proteina na Via de Sinalizacao dos Hormonios Tireoidianos no Carcinoma de Tireoide: Contribuicoes da Transcriptomica para a Enfermagem de Precisao</w:t>
       </w:r>
     </w:p>
     <w:p>
@@ -436,7 +437,7 @@
       <w:r>
         <w:rPr>
           <w:rFonts w:ascii="Times New Roman" w:cs="Times New Roman" w:eastAsia="Times New Roman" w:hAnsi="Times New Roman"/>
-          <w:b w:val="1"/>
+          <w:b/>
           <w:bCs w:val="1"/>
           <w:i w:val="0"/>
           <w:iCs w:val="0"/>
@@ -450,7 +451,7 @@
           <w:vertAlign w:val="baseline"/>
           <w:rtl w:val="0"/>
         </w:rPr>
-        <w:t xml:space="preserve">Resumo</w:t>
+        <w:t>Resumo</w:t>
       </w:r>
       <w:r>
         <w:rPr>
@@ -469,16 +470,13 @@
       <w:r>
         <w:rPr>
           <w:rFonts w:ascii="Times New Roman" w:cs="Times New Roman" w:eastAsia="Times New Roman" w:hAnsi="Times New Roman"/>
-          <w:sz w:val="20"/>
-          <w:szCs w:val="20"/>
-          <w:rtl w:val="0"/>
-        </w:rPr>
-        <w:t>Objetivou-se analisar a expressão diferencial de genes pertencentes à via de sinalização dos hormônios tireoidianos (SHT, KEGG hsa04919) no carcinoma de tireoide por meio de volcano plot e rede de interação proteína-proteína (PPI). Trata-se de estudo exploratório em bioinformática, com dados transcriptômicos do conjunto integrado TCGA-GTEx (THCA, n = 783) processados no ambiente R. Foram identificados 29 genes diferencialmente expressos (GDEs) na via SHT (9 superexpressos, 20 subexpressos; |log₂FC| &gt; 1; FDR &lt; 0,05). A rede PPI (STRING v12.0, escore ≥ 700) revelou 8 proteínas interagentes organizadas em dois módulos funcionais, com PRKCA como principal gene hub (grau = 5, betweenness = 0,476), atuando como elo entre os módulos. Os demais 21 GDEs não formaram interações de alta confiança na rede. Os achados geram hipóteses sobre possíveis mecanismos moleculares compartilhados entre o carcinoma de tireoide e processos cardiovasculares, sem que se estabeleça relação causal direta, contribuindo para futuras investigações translacionais em saúde de precisão.</w:t>
-      </w:r>
-      <w:r>
-        <w:rPr>
-          <w:rtl w:val="0"/>
-        </w:rPr>
+          <w:b w:val="0"/>
+          <w:i w:val="0"/>
+          <w:sz w:val="20"/>
+          <w:szCs w:val="20"/>
+          <w:rtl w:val="0"/>
+        </w:rPr>
+        <w:t>Objetivou-se analisar a expressao diferencial de genes pertencentes a via de sinalizacao dos hormonios tireoidianos (SHT, KEGG hsa04919) no carcinoma de tireoide por meio de volcano plot e rede de interacao proteina-proteina (PPI). Trata-se de estudo exploratorio em bioinformatica, com dados transcriptomicos do conjunto integrado TCGA-GTEx (THCA, n = 783) processados no ambiente R. Foram identificados 29 genes diferencialmente expressos (GDEs) na via SHT (9 superexpressos, 20 subexpressos; |log2FC| &gt; 1; FDR &lt; 0,05). A rede PPI (STRING v12.0, escore &gt;= 700) revelou 8 proteinas interagentes organizadas em dois modulos funcionais detectados pelo algoritmo walktrap, com PRKCA como principal gene hub (grau = 5, betweenness = 0,476), atuando como elo entre os modulos. Os demais 21 GDEs nao formaram interacoes de alta confianca na rede. Os achados geram hipoteses sobre possiveis mecanismos moleculares compartilhados entre o carcinoma de tireoide e processos cardiovasculares, sem que se estabeleca relacao causal direta, contribuindo para futuras investigacoes translacionais em saude de precisao.</w:t>
       </w:r>
     </w:p>
     <w:p>
@@ -505,7 +503,7 @@
       <w:r>
         <w:rPr>
           <w:rFonts w:ascii="Times New Roman" w:cs="Times New Roman" w:eastAsia="Times New Roman" w:hAnsi="Times New Roman"/>
-          <w:b w:val="1"/>
+          <w:b/>
           <w:bCs w:val="1"/>
           <w:i w:val="0"/>
           <w:iCs w:val="0"/>
@@ -519,13 +517,17 @@
           <w:vertAlign w:val="baseline"/>
           <w:rtl w:val="0"/>
         </w:rPr>
-        <w:t>Palavras-chave: Câncer de Tireoide; Transcriptômica; Redes de Interação Proteína-Proteína; Biologia Computacional; Saúde de Precisão.</w:t>
-      </w:r>
-      <w:r>
-        <w:rPr>
-          <w:rFonts w:ascii="Times New Roman" w:cs="Times New Roman" w:eastAsia="Times New Roman" w:hAnsi="Times New Roman"/>
-          <w:rtl w:val="0"/>
-        </w:rPr>
+        <w:t xml:space="preserve">Palavras-chave: </w:t>
+      </w:r>
+      <w:r>
+        <w:rPr>
+          <w:rFonts w:ascii="Times New Roman" w:cs="Times New Roman" w:eastAsia="Times New Roman" w:hAnsi="Times New Roman"/>
+          <w:b w:val="0"/>
+          <w:i w:val="0"/>
+          <w:sz w:val="22"/>
+          <w:rtl w:val="0"/>
+        </w:rPr>
+        <w:t>Cancer de Tireoide, Doencas Cardiovasculares, Informatica em Enfermagem.</w:t>
       </w:r>
       <w:r>
         <w:rPr>
@@ -576,7 +578,7 @@
       <w:r>
         <w:rPr>
           <w:rFonts w:ascii="Times New Roman" w:cs="Times New Roman" w:eastAsia="Times New Roman" w:hAnsi="Times New Roman"/>
-          <w:b w:val="1"/>
+          <w:b/>
           <w:bCs w:val="1"/>
           <w:i w:val="0"/>
           <w:iCs w:val="0"/>
@@ -590,7 +592,7 @@
           <w:vertAlign w:val="baseline"/>
           <w:rtl w:val="0"/>
         </w:rPr>
-        <w:t xml:space="preserve">1. Introdução</w:t>
+        <w:t>1. Introducao</w:t>
       </w:r>
     </w:p>
     <w:p>
@@ -619,12 +621,14 @@
       <w:r>
         <w:rPr>
           <w:rFonts w:ascii="Times New Roman" w:cs="Times New Roman" w:eastAsia="Times New Roman" w:hAnsi="Times New Roman"/>
+          <w:b w:val="0"/>
+          <w:i w:val="0"/>
           <w:sz w:val="24"/>
           <w:szCs w:val="24"/>
           <w:highlight w:val="white"/>
           <w:rtl w:val="0"/>
         </w:rPr>
-        <w:t>O carcinoma de tireoide origina-se nas células parenquimatosas da tireoide e apresenta incidência crescente mundialmente¹. A meta-análise de Tsai et al. (2023)² reportou maior risco de doença cerebrovascular (RR = 1,15; IC95%: 1,10–1,21) e fibrilação atrial (RR = 1,59; IC95%: 1,45–1,73) em indivíduos com câncer de tireoide comparados à população geral, sugerindo associação epidemiológica relevante entre essas condições. Contudo, os mecanismos moleculares subjacentes a essa associação permanecem pouco compreendidos. Análises transcriptômicas de dados públicos podem contribuir para a identificação de alvos moleculares compartilhados, auxiliando na formulação de hipóteses biológicas testáveis e fornecendo subsídios à saúde de precisão³.</w:t>
+        <w:t>O carcinoma de tireoide origina-se nas celulas parenquimatosas da tireoide e apresenta incidencia crescente mundialmente[1]. A meta-analise de Tsai et al. (2023)[2] reportou maior risco de doenca cerebrovascular (RR = 1,15; IC95%: 1,10-1,21) e fibrilacao atrial (RR = 1,59; IC95%: 1,45-1,73) em individuos com cancer de tireoide comparados a populacao geral, sugerindo associacao epidemiologica entre essas condicoes. Estudos de bioinformatica integrativa, como o de Zhang et al. (2021)[3], demonstraram a viabilidade de se identificar genes-chave e vias de sinalizacao relevantes no carcinoma de tireoide por meio de analise transcriptomica com dados publicos, evidenciando o potencial dessas abordagens para a descoberta de alvos moleculares. Entretanto, os mecanismos moleculares subjacentes a associacao entre cancer de tireoide e desfechos cardiovasculares permanecem pouco compreendidos, representando uma lacuna que abordagens transcriptomicas podem ajudar a explorar.</w:t>
       </w:r>
       <w:r>
         <w:rPr>
@@ -767,11 +771,13 @@
       <w:r>
         <w:rPr>
           <w:rFonts w:ascii="Times New Roman" w:cs="Times New Roman" w:eastAsia="Times New Roman" w:hAnsi="Times New Roman"/>
-          <w:sz w:val="24"/>
-          <w:szCs w:val="24"/>
-          <w:rtl w:val="0"/>
-        </w:rPr>
-        <w:t>Diante desse cenário, objetivou-se analisar a expressão diferencial dos genes pertencentes à via SHT (hsa04919) no carcinoma de tireoide e construir a rede PPI dos genes alterados, visando a identificar potenciais genes hub e módulos funcionais que possam representar mecanismos moleculares compartilhados entre a progressão tumoral tireoidiana e a biologia cardiovascular. O estudo limita-se à geração de hipóteses a partir de dados transcriptômicos tumorais, não pretendendo estabelecer causalidade ou inferir mecanismos sistêmicos sem validação experimental.</w:t>
+          <w:b w:val="0"/>
+          <w:i w:val="0"/>
+          <w:sz w:val="24"/>
+          <w:szCs w:val="24"/>
+          <w:rtl w:val="0"/>
+        </w:rPr>
+        <w:t>Diante desse cenario, objetivou-se analisar a expressao diferencial dos genes pertencentes a via SHT (hsa04919) no carcinoma de tireoide e construir a rede PPI dos genes alterados, visando a identificar potenciais genes hub e modulos funcionais que possam representar mecanismos moleculares compartilhados entre a progressao tumoral tireoidiana e a biologia cardiovascular. O estudo limita-se a geracao de hipoteses a partir de dados transcriptomicos tumorais, nao pretendendo estabelecer causalidade ou inferir mecanismos sistemicos sem validacao experimental.</w:t>
       </w:r>
       <w:r>
         <w:rPr>
@@ -827,7 +833,7 @@
       <w:r>
         <w:rPr>
           <w:rFonts w:ascii="Times New Roman" w:cs="Times New Roman" w:eastAsia="Times New Roman" w:hAnsi="Times New Roman"/>
-          <w:b w:val="1"/>
+          <w:b/>
           <w:bCs w:val="1"/>
           <w:i w:val="0"/>
           <w:iCs w:val="0"/>
@@ -841,7 +847,7 @@
           <w:vertAlign w:val="baseline"/>
           <w:rtl w:val="0"/>
         </w:rPr>
-        <w:t xml:space="preserve">2. Materiais e Métodos</w:t>
+        <w:t>2. Materiais e Metodos</w:t>
       </w:r>
       <w:r>
         <w:rPr>
@@ -885,7 +891,7 @@
           <w:vertAlign w:val="baseline"/>
           <w:rtl w:val="0"/>
         </w:rPr>
-        <w:t xml:space="preserve">2.1. Materiais</w:t>
+        <w:t>2.1. Materiais</w:t>
       </w:r>
       <w:r>
         <w:rPr>
@@ -907,11 +913,13 @@
       <w:r>
         <w:rPr>
           <w:rFonts w:ascii="Times New Roman" w:cs="Times New Roman" w:eastAsia="Times New Roman" w:hAnsi="Times New Roman"/>
-          <w:sz w:val="24"/>
-          <w:szCs w:val="24"/>
-          <w:rtl w:val="0"/>
-        </w:rPr>
-        <w:t>Trata-se de estudo exploratório, baseado em dados secundários, desenvolvido no campo da bioinformática aplicada à oncologia tireoidiana. Os dados de expressão gênica foram obtidos por meio da plataforma UCSC Xena Browser, utilizando o conjunto integrado TCGA-GTEx (504 amostras tumorais THCA; 279 amostras normais de tecido tireoidiano), disponibilizado em escala log₂. A análise de expressão diferencial foi conduzida com o pacote limma (modelo linear com moderação empírica de Bayes), considerando como critérios de significância |log₂ Fold Change| &gt; 1 e valor de p ajustado pelo método de Benjamini-Hochberg (FDR) &lt; 0,05. As interações proteína-proteína foram investigadas por meio do banco de dados STRING v12.0 (Homo sapiens, taxon 9606), adotando-se escore combinado mínimo de 700 (alta confiança). Os resultados foram representados por volcano plot e rede PPI.</w:t>
+          <w:b w:val="0"/>
+          <w:i w:val="0"/>
+          <w:sz w:val="24"/>
+          <w:szCs w:val="24"/>
+          <w:rtl w:val="0"/>
+        </w:rPr>
+        <w:t>Trata-se de estudo exploratorio, baseado em dados secundarios, desenvolvido no campo da bioinformatica aplicada a oncologia tireoidiana. Os dados de expressao genica foram obtidos por meio da plataforma UCSC Xena Browser, utilizando o conjunto integrado TCGA-GTEx (504 amostras tumorais THCA; 279 amostras normais de tecido tireoidiano), disponibilizado em escala log2. A analise de expressao diferencial foi conduzida com o pacote limma (modelo linear com moderacao empirica de Bayes), considerando como criterios de significancia |log2 Fold Change| &gt; 1 e valor de p ajustado pelo metodo de Benjamini-Hochberg (FDR) &lt; 0,05. As interacoes proteina-proteina foram investigadas por meio do banco de dados STRING v12.0 (Homo sapiens, taxon 9606), adotando-se escore combinado minimo de 700 (alta confianca). Os resultados foram representados por volcano plot e rede PPI.</w:t>
       </w:r>
       <w:r>
         <w:rPr>
@@ -1041,7 +1049,7 @@
           <w:vertAlign w:val="baseline"/>
           <w:rtl w:val="0"/>
         </w:rPr>
-        <w:t xml:space="preserve">2.2.  Metodologia</w:t>
+        <w:t>2.2. Metodologia</w:t>
       </w:r>
     </w:p>
     <w:p>
@@ -1058,11 +1066,13 @@
       <w:r>
         <w:rPr>
           <w:rFonts w:ascii="Times New Roman" w:cs="Times New Roman" w:eastAsia="Times New Roman" w:hAnsi="Times New Roman"/>
-          <w:sz w:val="24"/>
-          <w:szCs w:val="24"/>
-          <w:rtl w:val="0"/>
-        </w:rPr>
-        <w:t>Os dados transcriptômicos foram obtidos na plataforma UCSC Xena Browser a partir do conjunto integrado TCGA-GTEx referente ao carcinoma de tireoide (THCA), disponível em repositório público de livre acesso. A variável TCGA_GTEX_main_category foi utilizada para a estratificação biológica das amostras (GTEX Thyroid vs. TCGA Thyroid Carcinoma). Os genes da via SHT foram identificados via KEGG REST API (hsa04919). Todas as etapas de processamento foram executadas no ambiente R v4.6.0. Empregaram-se os pacotes KEGGREST (consulta à via metabólica), readr (importação de dados), limma (expressão diferencial), dplyr e tibble (manipulação de dados), httr e jsonlite (consulta à STRING REST API), igraph e ggraph (construção e visualização da rede PPI), e ggplot2 e ggrepel (volcano plot). O pipeline completo, os parâmetros de análise e os scripts reprodutíveis estão disponíveis publicamente em repositório GitHub (https://github.com/santosry/thyroid-volcano-ppi). Ressalta-se que a comparação TCGA versus GTEx pode estar sujeita a batch effects inerentes às diferenças de plataforma, processamento e perfil demográfico entre as coortes, constituindo limitação metodológica deste estudo.</w:t>
+          <w:b w:val="0"/>
+          <w:i w:val="0"/>
+          <w:sz w:val="24"/>
+          <w:szCs w:val="24"/>
+          <w:rtl w:val="0"/>
+        </w:rPr>
+        <w:t>Os dados transcriptomicos foram obtidos na plataforma UCSC Xena Browser a partir do conjunto integrado TCGA-GTEx referente ao carcinoma de tireoide (THCA), disponivel em repositorio publico de livre acesso. A variavel TCGA_GTEX_main_category foi utilizada para a estratificacao biologica das amostras (GTEX Thyroid vs. TCGA Thyroid Carcinoma). Os genes da via SHT foram identificados via KEGG REST API (hsa04919). Todas as etapas de processamento foram executadas no ambiente R v4.6.0. Empregaram-se os pacotes KEGGREST (consulta a via metabolica), readr (importacao de dados), limma (expressao diferencial), dplyr e tibble (manipulacao de dados), httr e jsonlite (consulta a STRING REST API), igraph e ggraph (construcao e visualizacao da rede PPI), e ggplot2 e ggrepel (volcano plot). O pipeline completo, os parametros de analise e os scripts reprodutiveis estao disponiveis publicamente em repositorio GitHub (https://github.com/santosry/thyroid-volcano-ppi). Ressalta-se que a comparacao TCGA versus GTEx pode estar sujeita a batch effects inerentes as diferencas de plataforma, processamento e perfil demografico entre as coortes, constituindo limitacao metodologica deste estudo.</w:t>
       </w:r>
       <w:r>
         <w:rPr>
@@ -1433,6 +1443,25 @@
       <w:r>
         <w:rPr>
           <w:rFonts w:ascii="Times New Roman" w:cs="Times New Roman" w:eastAsia="Times New Roman" w:hAnsi="Times New Roman"/>
+          <w:b/>
+          <w:bCs w:val="1"/>
+          <w:i w:val="0"/>
+          <w:iCs w:val="0"/>
+          <w:smallCaps w:val="0"/>
+          <w:strike w:val="0"/>
+          <w:color w:val="000000"/>
+          <w:sz w:val="24"/>
+          <w:szCs w:val="24"/>
+          <w:u w:val="none"/>
+          <w:shd w:fill="auto" w:val="clear"/>
+          <w:vertAlign w:val="baseline"/>
+          <w:rtl w:val="0"/>
+        </w:rPr>
+        <w:t>3. Resultados e Discussao</w:t>
+      </w:r>
+      <w:r>
+        <w:rPr>
+          <w:rFonts w:ascii="Times New Roman" w:cs="Times New Roman" w:eastAsia="Times New Roman" w:hAnsi="Times New Roman"/>
           <w:b w:val="1"/>
           <w:bCs w:val="1"/>
           <w:i w:val="0"/>
@@ -1447,26 +1476,6 @@
           <w:vertAlign w:val="baseline"/>
           <w:rtl w:val="0"/>
         </w:rPr>
-        <w:t xml:space="preserve">3. Resultados e </w:t>
-      </w:r>
-      <w:r>
-        <w:rPr>
-          <w:rFonts w:ascii="Times New Roman" w:cs="Times New Roman" w:eastAsia="Times New Roman" w:hAnsi="Times New Roman"/>
-          <w:b w:val="1"/>
-          <w:bCs w:val="1"/>
-          <w:i w:val="0"/>
-          <w:iCs w:val="0"/>
-          <w:smallCaps w:val="0"/>
-          <w:strike w:val="0"/>
-          <w:color w:val="000000"/>
-          <w:sz w:val="24"/>
-          <w:szCs w:val="24"/>
-          <w:u w:val="none"/>
-          <w:shd w:fill="auto" w:val="clear"/>
-          <w:vertAlign w:val="baseline"/>
-          <w:rtl w:val="0"/>
-        </w:rPr>
-        <w:t xml:space="preserve">Discussão</w:t>
       </w:r>
       <w:r>
         <w:rPr>
@@ -1488,11 +1497,13 @@
       <w:r>
         <w:rPr>
           <w:rFonts w:ascii="Times New Roman" w:cs="Times New Roman" w:eastAsia="Times New Roman" w:hAnsi="Times New Roman"/>
-          <w:sz w:val="24"/>
-          <w:szCs w:val="24"/>
-          <w:rtl w:val="0"/>
-        </w:rPr>
-        <w:t>Foram analisados 119 genes da via SHT (hsa04919), dos quais 29 (24,4%) apresentaram expressão diferencial significativa: 9 superexpressos e 20 subexpressos no tumor em relação ao tecido normal (|log₂FC| &gt; 1; FDR &lt; 0,05). A Figura 1 apresenta o volcano plot com a distribuição dos genes, destacando-se MYH7 (log₂FC = −5,59; FDR = 7,3×10⁻²²⁴), DIO3 (log₂FC = −4,97; FDR = 4,4×10⁻¹⁶⁸), MYH6 (log₂FC = −4,42; FDR = 1,5×10⁻¹⁵⁷), RXRG (log₂FC = 5,28; FDR = 3,3×10⁻¹⁴⁹) e CCND1 (log₂FC = 2,65; FDR = 1,0×10⁻²¹⁴) entre os mais significativos. A rede PPI (Figura 2), construída com escore STRING ≥ 700, resultou em 8 proteínas interagentes — das 29 GDEs — organizadas em dois módulos funcionais. Os 21 GDEs restantes, incluindo MYH7 e DIO3, não apresentaram interações de alta confiança na rede STRING. O Módulo 1 reuniu genes envolvidos em sinalização intracelular mediada por fosfolipases C e proteínas quinase C (PRKCA, PRKCG, PLCG1, PLCD4), enquanto o Módulo 2 agregou genes relacionados à organização estrutural celular e interações célula-matriz (ACTG1, ITGAV). PLCD3 e PIK3R2 também integraram a rede, porém com menor conectividade.</w:t>
+          <w:b w:val="0"/>
+          <w:i w:val="0"/>
+          <w:sz w:val="24"/>
+          <w:szCs w:val="24"/>
+          <w:rtl w:val="0"/>
+        </w:rPr>
+        <w:t>Foram analisados 119 genes da via SHT (hsa04919), dos quais 29 (24,4%) apresentaram expressao diferencial significativa: 9 superexpressos e 20 subexpressos no tumor em relacao ao tecido normal (|log2FC| &gt; 1; FDR &lt; 0,05). A Figura 1 apresenta o volcano plot com a distribuicao dos genes, destacando-se MYH7 (log2FC = -5,59; FDR = 7,3x10-224), DIO3 (log2FC = -4,97; FDR = 4,4x10-168), MYH6 (log2FC = -4,42; FDR = 1,5x10-157), RXRG (log2FC = 5,28; FDR = 3,3x10-149) e CCND1 (log2FC = 2,65; FDR = 1,0x10-214) entre os mais significativos. A rede PPI (Figura 2), construida com escore STRING &gt;= 700, resultou em 8 proteinas interagentes das 29 GDEs, organizadas em dois modulos funcionais detectados por walktrap. Os 21 GDEs restantes, incluindo MYH7 e DIO3, nao apresentaram interacoes de alta confianca na rede STRING. O Modulo 1 reuniu genes envolvidos em sinalizacao intracelular mediada por fosfolipases C e proteinas quinase C (PRKCA, PRKCG, PLCG1, PLCD4), enquanto o Modulo 2 agregou genes relacionados a organizacao estrutural celular e interacoes celula-matriz (ACTG1, ITGAV). PLCD3 e PIK3R2 tambem integraram a rede, porem com menor conectividade.</w:t>
       </w:r>
       <w:r>
         <w:rPr>
@@ -1596,11 +1607,13 @@
       <w:r>
         <w:rPr>
           <w:rFonts w:ascii="Times New Roman" w:cs="Times New Roman" w:eastAsia="Times New Roman" w:hAnsi="Times New Roman"/>
-          <w:sz w:val="24"/>
-          <w:szCs w:val="24"/>
-          <w:rtl w:val="0"/>
-        </w:rPr>
-        <w:t>PRKCA destacou-se como principal gene hub da rede (grau = 5; betweenness = 0,476; closeness = 8,52×10⁻⁴; hub score = 1,000), exibindo o maior número de interações e atuando como elo funcional entre os dois módulos (Figura 2). Os demais hubs identificados foram PLCG1 (grau = 4; betweenness = 0,286), PLCD4 (grau = 4; betweenness = 0,095) e PRKCG (grau = 4). A posição topológica central de PRKCA é compatível com seu papel biológico na regulação de proliferação, diferenciação e sobrevivência celular — processos relevantes tanto para a oncogênese tireoidiana quanto para a fisiologia cardiovascular. A conectividade entre os módulos, estabelecida exclusivamente pela interação PRKCA-ACTG1 (escore STRING = 918), sugere que PRKCA pode coordenar alterações na arquitetura celular e nas interações com a matriz extracelular via sinalização por fosfolipases C e PKC. Dados os papéis conhecidos de PRKCA, PLCG1 e PRKCG na contratilidade miocárdica, no remodelamento cardíaco e na regulação do cálcio intracelular, a convergência desses genes como hubs na rede PPI do carcinoma tireoidiano gera hipóteses sobre possíveis mecanismos moleculares compartilhados que merecem investigação experimental futura. Contudo, ressalta-se que a rede PPI do STRING reflete conhecimento acumulado da literatura e não demonstra causalidade, ativação ou inibição direta. A identificação de hubs constitui observação exploratória.</w:t>
+          <w:b w:val="0"/>
+          <w:i w:val="0"/>
+          <w:sz w:val="24"/>
+          <w:szCs w:val="24"/>
+          <w:rtl w:val="0"/>
+        </w:rPr>
+        <w:t>PRKCA destacou-se como principal gene hub da rede (grau = 5; betweenness = 0,476; closeness = 8,52x10-4; hub score = 1,000), exibindo o maior numero de interacoes e atuando como elo funcional entre os dois modulos (Figura 2). Os demais hubs identificados foram PLCG1 (grau = 4; betweenness = 0,286), PLCD4 (grau = 4; betweenness = 0,095) e PRKCG (grau = 4). A posicao topologica central de PRKCA e compativel com seu papel biologico na regulacao de proliferacao, diferenciacao e sobrevivencia celular, processos relevantes tanto para a oncogenese tireoidiana quanto para a fisiologia cardiovascular. A conectividade entre os modulos, estabelecida exclusivamente pela interacao PRKCA-ACTG1 (escore STRING = 918), sugere que PRKCA pode coordenar alteracoes na arquitetura celular e nas interacoes com a matriz extracelular. Dados os papeis conhecidos de PRKCA, PLCG1 e PRKCG na contratilidade miocardica, no remodelamento cardiaco e na regulacao do calcio intracelular, a convergencia desses genes como hubs na rede PPI do carcinoma tireoidiano gera hipoteses sobre possiveis mecanismos moleculares compartilhados que merecem investigacao experimental futura. Contudo, ressalta-se que a rede PPI do STRING reflete conhecimento acumulado da literatura e nao demonstra causalidade, ativacao ou inibicao direta. A identificacao de hubs constitui observacao exploratoria.</w:t>
       </w:r>
     </w:p>
     <w:p>
@@ -1618,12 +1631,14 @@
       <w:r>
         <w:rPr>
           <w:rFonts w:ascii="Times New Roman" w:cs="Times New Roman" w:eastAsia="Times New Roman" w:hAnsi="Times New Roman"/>
+          <w:b w:val="0"/>
+          <w:i w:val="0"/>
           <w:sz w:val="24"/>
           <w:szCs w:val="24"/>
           <w:highlight w:val="white"/>
           <w:rtl w:val="0"/>
         </w:rPr>
-        <w:t>A enfermagem de precisão pode utilizar informações ômicas para avançar de um modelo focado na doença para uma abordagem baseada no perfil molecular do indivíduo, auxiliando no diagnóstico precoce, na estratificação de risco e na prevenção de comorbidades. Embora os achados deste estudo sejam exploratórios e não possuam aplicabilidade clínica imediata, a identificação de genes com funções reconhecidas na biologia cardiovascular — alterados no microambiente tumoral tireoidiano — fornece subsídios para a formulação de hipóteses que, uma vez validadas experimentalmente, poderão informar protocolos de vigilância clínica individualizados. Nesse contexto, a enfermagem deve desenvolver planos estratégicos que integrem o conhecimento multiômico na pesquisa, no ensino, na prática clínica e nas políticas de saúde, considerando sua posição privilegiada nessa nova era⁴.</w:t>
+        <w:t>A enfermagem de precisao, conforme o marco conceitual de Fu et al. (2020)[4], propoe a utilizacao de dados omicos para personalizar intervencoes nos dominios de pesquisa, ensino, pratica clinica e politicas de saude. Embora os achados deste estudo sejam exploratorios e nao possuam aplicabilidade clinica imediata, a identificacao de genes com funcoes reconhecidas na biologia cardiovascular alterados no microambiente tumoral tireoidiano fornece subsidios para a formulacao de hipoteses que, uma vez validadas experimentalmente, poderao informar protocolos de vigilancia clinica individualizados. Nesse contexto, o enfermeiro ocupa posicao privilegiada para integrar o conhecimento multiomico a pratica assistencial, considerando as facetas sociocultural, ambiental e economica do cotidiano do paciente, conforme preconizado pela saude de precisao[4].</w:t>
       </w:r>
       <w:r>
         <w:rPr>
@@ -1692,7 +1707,7 @@
       <w:r>
         <w:rPr>
           <w:rFonts w:ascii="Times New Roman" w:cs="Times New Roman" w:eastAsia="Times New Roman" w:hAnsi="Times New Roman"/>
-          <w:b w:val="1"/>
+          <w:b/>
           <w:bCs w:val="1"/>
           <w:i w:val="0"/>
           <w:iCs w:val="0"/>
@@ -1706,7 +1721,7 @@
           <w:vertAlign w:val="baseline"/>
           <w:rtl w:val="0"/>
         </w:rPr>
-        <w:t xml:space="preserve">4. Conclusões</w:t>
+        <w:t>4. Conclusoes</w:t>
       </w:r>
       <w:r>
         <w:rPr>
@@ -1755,7 +1770,7 @@
           <w:vertAlign w:val="baseline"/>
           <w:rtl w:val="0"/>
         </w:rPr>
-        <w:t>Este estudo identificou 29 genes da via SHT diferencialmente expressos no carcinoma de tireoide, com PRKCA emergindo como gene hub central na rede PPI, conectando módulos de sinalização intracelular e organização estrutural. Genes com funções cardiovasculares reconhecidas (MYH6, MYH7, PLN, ATP2A1) apresentaram expressão acentuadamente reduzida no tecido tumoral, enquanto reguladores do ciclo celular (CCND1) e da resposta imune (STAT1) mostraram-se superexpressos. Ressalta-se que alterações transcriptômicas locais no microambiente tumoral não implicam necessariamente disfunção sistêmica ou causalidade cardiovascular. O carcinoma de tireoide apresenta alterações transcriptômicas na via de sinalização dos hormônios tireoidianos que envolvem genes com funções reconhecidas na biologia cardiovascular. Essas alterações podem representar mecanismos moleculares compartilhados entre a progressão tumoral e processos cardiovasculares, gerando hipóteses para futuras investigações translacionais em saúde de precisão.</w:t>
+        <w:t>Este estudo identificou 29 genes da via SHT diferencialmente expressos no carcinoma de tireoide, com PRKCA emergindo como gene hub central na rede PPI, conectando modulos de sinalizacao intracelular e organizacao estrutural. Genes com funcoes cardiovasculares reconhecidas (MYH6, MYH7, PLN, ATP2A1) apresentaram expressao acentuadamente reduzida no tecido tumoral, enquanto reguladores do ciclo celular (CCND1) e da resposta imune (STAT1) mostraram-se superexpressos. Ressalta-se que alteracoes transcriptomicas locais no microambiente tumoral nao implicam necessariamente disfuncao sistemica ou causalidade cardiovascular. O carcinoma de tireoide apresenta alteracoes transcriptomicas na via de sinalizacao dos hormonios tireoidianos que envolvem genes com funcoes reconhecidas na biologia cardiovascular. Essas alteracoes podem representar mecanismos moleculares compartilhados entre a progressao tumoral e processos cardiovasculares, gerando hipoteses para futuras investigacoes translacionais em saude de precisao.</w:t>
       </w:r>
       <w:r>
         <w:rPr>
@@ -2128,7 +2143,7 @@
       <w:r>
         <w:rPr>
           <w:rFonts w:ascii="Times New Roman" w:cs="Times New Roman" w:eastAsia="Times New Roman" w:hAnsi="Times New Roman"/>
-          <w:b w:val="1"/>
+          <w:b/>
           <w:bCs w:val="1"/>
           <w:i w:val="0"/>
           <w:iCs w:val="0"/>
@@ -2141,7 +2156,7 @@
           <w:vertAlign w:val="baseline"/>
           <w:rtl w:val="0"/>
         </w:rPr>
-        <w:t xml:space="preserve">Agradecimentos</w:t>
+        <w:t>Agradecimentos</w:t>
       </w:r>
       <w:r>
         <w:rPr>
@@ -2165,11 +2180,13 @@
       <w:r>
         <w:rPr>
           <w:rFonts w:ascii="Times New Roman" w:cs="Times New Roman" w:eastAsia="Times New Roman" w:hAnsi="Times New Roman"/>
-          <w:sz w:val="24"/>
-          <w:szCs w:val="24"/>
-          <w:rtl w:val="0"/>
-        </w:rPr>
-        <w:t xml:space="preserve">Agradecemos à Escola Técnica Estadual João Barcelos Martins e ao Instituto Federal Fluminense de Educação, Ciência e Tecnologia Campus Campos Guarus pela promoção dessa troca sinérgica.</w:t>
+          <w:b w:val="0"/>
+          <w:i w:val="0"/>
+          <w:sz w:val="24"/>
+          <w:szCs w:val="24"/>
+          <w:rtl w:val="0"/>
+        </w:rPr>
+        <w:t>Agradecemos a Escola Tecnica Estadual Joao Barcelos Martins e ao Instituto Federal Fluminense de Educacao, Ciencia e Tecnologia Campus Campos Guarus pela promocao dessa troca sinergica.</w:t>
       </w:r>
       <w:r>
         <w:rPr>
@@ -2213,7 +2230,7 @@
       <w:r>
         <w:rPr>
           <w:rFonts w:ascii="Times New Roman" w:cs="Times New Roman" w:eastAsia="Times New Roman" w:hAnsi="Times New Roman"/>
-          <w:b w:val="1"/>
+          <w:b/>
           <w:bCs w:val="1"/>
           <w:i w:val="0"/>
           <w:iCs w:val="0"/>
@@ -2227,7 +2244,7 @@
           <w:vertAlign w:val="baseline"/>
           <w:rtl w:val="0"/>
         </w:rPr>
-        <w:t xml:space="preserve">Referências</w:t>
+        <w:t>Referencias</w:t>
       </w:r>
     </w:p>
     <w:p>

</xml_diff>

<commit_message>
v3.1.0 locked: titulo, hipotese, objetivo geral, objetivos especificos e conclusao conceitual aplicados ao resumo expandido conforme versoes lockadas fornecidas
</commit_message>
<xml_diff>
--- a/resumo_expandido_tireoide_2026.docx
+++ b/resumo_expandido_tireoide_2026.docx
@@ -24,7 +24,7 @@
           <w:szCs w:val="24"/>
           <w:rtl w:val="0"/>
         </w:rPr>
-        <w:t>Expressao Diferencial e Rede de Interacao Proteina-Proteina na Via de Sinalizacao dos Hormonios Tireoidianos no Carcinoma de Tireoide: Contribuicoes da Transcriptomica para a Enfermagem de Precisao</w:t>
+        <w:t>Analise Transcriptomica da Via de Sinalizacao do Hormonio Tireoidiano no Carcinoma de Tireoide e Potenciais Implicacoes para a Enfermagem de Precisao</w:t>
       </w:r>
     </w:p>
     <w:p>
@@ -476,7 +476,7 @@
           <w:szCs w:val="20"/>
           <w:rtl w:val="0"/>
         </w:rPr>
-        <w:t>Objetivou-se analisar a expressao diferencial de genes pertencentes a via de sinalizacao dos hormonios tireoidianos (SHT, KEGG hsa04919) no carcinoma de tireoide por meio de volcano plot e rede de interacao proteina-proteina (PPI). Trata-se de estudo exploratorio em bioinformatica, com dados transcriptomicos do conjunto integrado TCGA-GTEx (THCA, n = 783) processados no ambiente R. Foram identificados 29 genes diferencialmente expressos (GDEs) na via SHT (9 superexpressos, 20 subexpressos; |log2FC| &gt; 1; FDR &lt; 0,05). A rede PPI (STRING v12.0, escore &gt;= 700) revelou 8 proteinas interagentes organizadas em dois modulos funcionais detectados pelo algoritmo walktrap, com PRKCA como principal gene hub (grau = 5, betweenness = 0,476), atuando como elo entre os modulos. Os demais 21 GDEs nao formaram interacoes de alta confianca na rede. Os achados geram hipoteses sobre possiveis mecanismos moleculares compartilhados entre o carcinoma de tireoide e processos cardiovasculares, sem que se estabeleca relacao causal direta, contribuindo para futuras investigacoes translacionais em saude de precisao.</w:t>
+        <w:t>Objetivou-se analisar a expressao diferencial dos genes da via de sinalizacao do hormonio tireoidiano (SHT, KEGG hsa04919) no carcinoma de tireoide, identificando alteracoes transcriptomicas e padroes de interacao proteina-proteina capazes de gerar hipoteses biologicas sobre mecanismos moleculares envolvidos na doenca. Trata-se de estudo exploratorio em bioinformatica, com dados de RNA-seq do conjunto integrado TCGA-GTEx (THCA, n = 783) processados no ambiente R. Foram identificados 29 genes diferencialmente expressos (GDEs) na via SHT (9 superexpressos, 20 subexpressos; |log2FC| &gt; 1; FDR &lt; 0,05) por meio de volcano plot. A rede PPI (STRING v12.0, escore &gt;= 700) revelou 8 proteinas interagentes organizadas em dois modulos funcionais detectados pelo algoritmo walktrap, com PRKCA como principal gene hub (grau = 5, betweenness = 0,476), atuando como elo entre os modulos. Os demais 21 GDEs nao formaram interacoes de alta confianca na rede. O carcinoma de tireoide apresenta alteracoes transcriptomicas na via SHT, refletindo processos moleculares associados a biologia tumoral. A identificacao desses genes e de suas interacoes proteicas contribui para a geracao de hipoteses biologicas relevantes para futuras investigacoes em oncologia molecular e enfermagem de precisao.</w:t>
       </w:r>
     </w:p>
     <w:p>
@@ -628,7 +628,7 @@
           <w:highlight w:val="white"/>
           <w:rtl w:val="0"/>
         </w:rPr>
-        <w:t>O carcinoma de tireoide origina-se nas celulas parenquimatosas da tireoide e apresenta incidencia crescente mundialmente[1]. A meta-analise de Tsai et al. (2023)[2] reportou maior risco de doenca cerebrovascular (RR = 1,15; IC95%: 1,10-1,21) e fibrilacao atrial (RR = 1,59; IC95%: 1,45-1,73) em individuos com cancer de tireoide comparados a populacao geral, sugerindo associacao epidemiologica entre essas condicoes. Estudos de bioinformatica integrativa, como o de Zhang et al. (2021)[3], demonstraram a viabilidade de se identificar genes-chave e vias de sinalizacao relevantes no carcinoma de tireoide por meio de analise transcriptomica com dados publicos, evidenciando o potencial dessas abordagens para a descoberta de alvos moleculares. Entretanto, os mecanismos moleculares subjacentes a associacao entre cancer de tireoide e desfechos cardiovasculares permanecem pouco compreendidos, representando uma lacuna que abordagens transcriptomicas podem ajudar a explorar.</w:t>
+        <w:t>O carcinoma de tireoide origina-se nas celulas parenquimatosas da tireoide e apresenta incidencia crescente mundialmente[1]. A meta-analise de Tsai et al. (2023)[2] reportou maior risco de doenca cerebrovascular (RR = 1,15; IC95%: 1,10-1,21) e fibrilacao atrial (RR = 1,59; IC95%: 1,45-1,73) em individuos com cancer de tireoide comparados a populacao geral, sugerindo associacao epidemiologica entre essas condicoes. Estudos de bioinformatica integrativa, como o de Zhang et al. (2021)[3], demonstraram a viabilidade de se identificar genes-chave e vias de sinalizacao relevantes no carcinoma de tireoide por meio de analise transcriptomica com dados publicos, evidenciando o potencial dessas abordagens para a descoberta de alvos moleculares. Entretanto, os mecanismos moleculares subjacentes a essa associacao permanecem pouco compreendidos. O carcinoma de tireoide apresenta alteracoes transcriptomicas em genes da via de sinalizacao do hormonio tireoidiano (hsa04919), refletindo processos moleculares associados a biologia tumoral. A identificacao desses genes e de suas interacoes proteicas pode contribuir para a geracao de hipoteses biologicas relevantes para futuras investigacoes em oncologia molecular e enfermagem de precisao.</w:t>
       </w:r>
       <w:r>
         <w:rPr>
@@ -777,7 +777,7 @@
           <w:szCs w:val="24"/>
           <w:rtl w:val="0"/>
         </w:rPr>
-        <w:t>Diante desse cenario, objetivou-se analisar a expressao diferencial dos genes pertencentes a via SHT (hsa04919) no carcinoma de tireoide e construir a rede PPI dos genes alterados, visando a identificar potenciais genes hub e modulos funcionais que possam representar mecanismos moleculares compartilhados entre a progressao tumoral tireoidiana e a biologia cardiovascular. O estudo limita-se a geracao de hipoteses a partir de dados transcriptomicos tumorais, nao pretendendo estabelecer causalidade ou inferir mecanismos sistemicos sem validacao experimental.</w:t>
+        <w:t>Diante desse cenario, objetivou-se analisar a expressao diferencial dos genes da via de sinalizacao do hormonio tireoidiano (hsa04919) no carcinoma de tireoide, identificando alteracoes transcriptomicas e padroes de interacao proteina-proteina capazes de gerar hipoteses biologicas sobre mecanismos moleculares envolvidos na doenca e discutir sua relevancia para a enfermagem de precisao. Especificamente, buscou-se: (i) identificar genes diferencialmente expressos da via SHT no carcinoma de tireoide em comparacao ao tecido tireoidiano normal; (ii) construir uma rede de interacao proteina-proteina dos GDEs; (iii) identificar genes com elevada centralidade e potencial relevancia biologica na rede; e (iv) discutir as contribuicoes dos achados para a compreensao molecular do carcinoma de tireoide e suas potenciais aplicacoes futuras na enfermagem de precisao.</w:t>
       </w:r>
       <w:r>
         <w:rPr>
@@ -1613,7 +1613,7 @@
           <w:szCs w:val="24"/>
           <w:rtl w:val="0"/>
         </w:rPr>
-        <w:t>PRKCA destacou-se como principal gene hub da rede (grau = 5; betweenness = 0,476; closeness = 8,52x10-4; hub score = 1,000), exibindo o maior numero de interacoes e atuando como elo funcional entre os dois modulos (Figura 2). Os demais hubs identificados foram PLCG1 (grau = 4; betweenness = 0,286), PLCD4 (grau = 4; betweenness = 0,095) e PRKCG (grau = 4). A posicao topologica central de PRKCA e compativel com seu papel biologico na regulacao de proliferacao, diferenciacao e sobrevivencia celular, processos relevantes tanto para a oncogenese tireoidiana quanto para a fisiologia cardiovascular. A conectividade entre os modulos, estabelecida exclusivamente pela interacao PRKCA-ACTG1 (escore STRING = 918), sugere que PRKCA pode coordenar alteracoes na arquitetura celular e nas interacoes com a matriz extracelular. Dados os papeis conhecidos de PRKCA, PLCG1 e PRKCG na contratilidade miocardica, no remodelamento cardiaco e na regulacao do calcio intracelular, a convergencia desses genes como hubs na rede PPI do carcinoma tireoidiano gera hipoteses sobre possiveis mecanismos moleculares compartilhados que merecem investigacao experimental futura. Contudo, ressalta-se que a rede PPI do STRING reflete conhecimento acumulado da literatura e nao demonstra causalidade, ativacao ou inibicao direta. A identificacao de hubs constitui observacao exploratoria.</w:t>
+        <w:t>PRKCA destacou-se como principal gene hub da rede (grau = 5; betweenness = 0,476; closeness = 8,52x10-4; hub score = 1,000), exibindo o maior numero de interacoes e atuando como elo funcional entre os dois modulos (Figura 2). Os demais hubs identificados foram PLCG1 (grau = 4; betweenness = 0,286), PLCD4 (grau = 4; betweenness = 0,095) e PRKCG (grau = 4). A posicao topologica central de PRKCA e compativel com seu papel biologico na regulacao de proliferacao, diferenciacao e sobrevivencia celular, processos relevantes para a oncogenese tireoidiana. A conectividade entre os modulos, estabelecida exclusivamente pela interacao PRKCA-ACTG1 (escore STRING = 918), sugere que PRKCA pode coordenar alteracoes na arquitetura celular e nas interacoes com a matriz extracelular via sinalizacao por fosfolipases C e PKC. Contudo, ressalta-se que a rede PPI do STRING reflete conhecimento acumulado da literatura e nao demonstra causalidade, ativacao ou inibicao direta. A identificacao de hubs constitui observacao exploratoria.</w:t>
       </w:r>
     </w:p>
     <w:p>
@@ -1638,7 +1638,7 @@
           <w:highlight w:val="white"/>
           <w:rtl w:val="0"/>
         </w:rPr>
-        <w:t>A enfermagem de precisao, conforme o marco conceitual de Fu et al. (2020)[4], propoe a utilizacao de dados omicos para personalizar intervencoes nos dominios de pesquisa, ensino, pratica clinica e politicas de saude. Embora os achados deste estudo sejam exploratorios e nao possuam aplicabilidade clinica imediata, a identificacao de genes com funcoes reconhecidas na biologia cardiovascular alterados no microambiente tumoral tireoidiano fornece subsidios para a formulacao de hipoteses que, uma vez validadas experimentalmente, poderao informar protocolos de vigilancia clinica individualizados. Nesse contexto, o enfermeiro ocupa posicao privilegiada para integrar o conhecimento multiomico a pratica assistencial, considerando as facetas sociocultural, ambiental e economica do cotidiano do paciente, conforme preconizado pela saude de precisao[4].</w:t>
+        <w:t>A enfermagem de precisao, conforme o marco conceitual de Fu et al. (2020)[4], propoe a utilizacao de dados omicos para personalizar intervencoes nos dominios de pesquisa, ensino, pratica clinica e politicas de saude. Embora os achados deste estudo sejam exploratorios e nao possuam aplicabilidade clinica imediata, a identificacao de genes com funcoes reconhecidas na biologia tumoral e nas vias de sinalizacao celular fornece subsidios para a formulacao de hipoteses que, uma vez validadas experimentalmente, poderao informar protocolos de vigilancia e estratificacao de risco no cuidado oncologico. Nesse contexto, o enfermeiro ocupa posicao privilegiada para integrar o conhecimento multiomico a pratica assistencial, considerando as facetas sociocultural, ambiental e economica do cotidiano do paciente, conforme preconizado pela saude de precisao[4].</w:t>
       </w:r>
       <w:r>
         <w:rPr>
@@ -1770,7 +1770,7 @@
           <w:vertAlign w:val="baseline"/>
           <w:rtl w:val="0"/>
         </w:rPr>
-        <w:t>Este estudo identificou 29 genes da via SHT diferencialmente expressos no carcinoma de tireoide, com PRKCA emergindo como gene hub central na rede PPI, conectando modulos de sinalizacao intracelular e organizacao estrutural. Genes com funcoes cardiovasculares reconhecidas (MYH6, MYH7, PLN, ATP2A1) apresentaram expressao acentuadamente reduzida no tecido tumoral, enquanto reguladores do ciclo celular (CCND1) e da resposta imune (STAT1) mostraram-se superexpressos. Ressalta-se que alteracoes transcriptomicas locais no microambiente tumoral nao implicam necessariamente disfuncao sistemica ou causalidade cardiovascular. O carcinoma de tireoide apresenta alteracoes transcriptomicas na via de sinalizacao dos hormonios tireoidianos que envolvem genes com funcoes reconhecidas na biologia cardiovascular. Essas alteracoes podem representar mecanismos moleculares compartilhados entre a progressao tumoral e processos cardiovasculares, gerando hipoteses para futuras investigacoes translacionais em saude de precisao.</w:t>
+        <w:t>Este estudo nao busca demonstrar mecanismos cardiovasculares, biomarcadores clinicos ou relacoes causais. Seu proposito e caracterizar alteracoes transcriptomicas na via de sinalizacao do hormonio tireoidiano e identificar genes relevantes dentro de uma rede de interacao proteina-proteina, gerando hipoteses biologicas para investigacoes futuras. Foram identificados 29 genes da via SHT diferencialmente expressos no carcinoma de tireoide, com PRKCA emergindo como gene hub central na rede PPI (grau = 5, betweenness = 0,476), conectando modulos de sinalizacao intracelular e organizacao estrutural. Genes com alta significancia estatistica (MYH6, MYH7, DIO3, CCND1) e genes com elevada centralidade na rede (PRKCA, PLCG1, PLCD4, PRKCG) constituem candidatos prioritarios para investigacoes de validacao experimental. A enfermagem de precisao e apresentada como campo potencial de aplicacao translacional dos conhecimentos produzidos, e nao como desfecho diretamente demonstrado pelos dados.</w:t>
       </w:r>
       <w:r>
         <w:rPr>

</xml_diff>

<commit_message>
lock final: remove cardiovascular overclaims and align thyroid hormone signaling transcriptomic scope with precision nursing
</commit_message>
<xml_diff>
--- a/resumo_expandido_tireoide_2026.docx
+++ b/resumo_expandido_tireoide_2026.docx
@@ -24,7 +24,7 @@
           <w:szCs w:val="24"/>
           <w:rtl w:val="0"/>
         </w:rPr>
-        <w:t>Analise Transcriptomica da Via de Sinalizacao do Hormonio Tireoidiano no Carcinoma de Tireoide e Potenciais Implicacoes para a Enfermagem de Precisao</w:t>
+        <w:t>Análise Transcriptômica da Via de Sinalização do Hormônio Tireoidiano no Carcinoma de Tireoide e Potenciais Implicações para a Enfermagem de Precisão</w:t>
       </w:r>
     </w:p>
     <w:p>
@@ -476,7 +476,7 @@
           <w:szCs w:val="20"/>
           <w:rtl w:val="0"/>
         </w:rPr>
-        <w:t>Objetivou-se analisar a expressao diferencial dos genes da via de sinalizacao do hormonio tireoidiano (SHT, KEGG hsa04919) no carcinoma de tireoide, identificando alteracoes transcriptomicas e padroes de interacao proteina-proteina capazes de gerar hipoteses biologicas sobre mecanismos moleculares envolvidos na doenca. Trata-se de estudo exploratorio em bioinformatica, com dados de RNA-seq do conjunto integrado TCGA-GTEx (THCA, n = 783) processados no ambiente R. Foram identificados 29 genes diferencialmente expressos (GDEs) na via SHT (9 superexpressos, 20 subexpressos; |log2FC| &gt; 1; FDR &lt; 0,05) por meio de volcano plot. A rede PPI (STRING v12.0, escore &gt;= 700) revelou 8 proteinas interagentes organizadas em dois modulos funcionais detectados pelo algoritmo walktrap, com PRKCA como principal gene hub (grau = 5, betweenness = 0,476), atuando como elo entre os modulos. Os demais 21 GDEs nao formaram interacoes de alta confianca na rede. O carcinoma de tireoide apresenta alteracoes transcriptomicas na via SHT, refletindo processos moleculares associados a biologia tumoral. A identificacao desses genes e de suas interacoes proteicas contribui para a geracao de hipoteses biologicas relevantes para futuras investigacoes em oncologia molecular e enfermagem de precisao.</w:t>
+        <w:t>Objetivou-se analisar a expressão diferencial dos genes da via de sinalização do hormônio tireoidiano (SHT, KEGG hsa04919) no carcinoma de tireoide, identificando alterações transcriptômicas e padrões de interação proteína-proteína capazes de gerar hipóteses biológicas sobre mecanismos moleculares envolvidos na doença. Trata-se de estudo exploratório em bioinformática, com dados de RNA-seq do conjunto integrado TCGA-GTEx (THCA, n = 783) processados no ambiente R. Foram identificados 29 genes diferencialmente expressos (GDEs) na via SHT (9 superexpressos, 20 subexpressos; |log2FC| &gt; 1; FDR &lt; 0,05) por meio de volcano plot. A rede de interação proteína-proteína (PPI) foi construída com STRING v12.0 (escore &gt;= 700), revelando 8 proteínas interagentes organizadas em dois módulos funcionais detectados pelo algoritmo walktrap. PRKCA destacou-se como gene de maior centralidade na rede (grau = 5, betweenness = 0,476), atuando como elo entre os módulos. Os demais 21 GDEs não formaram interações de alta confiança na rede. Os achados geram hipóteses biológicas sobre a via de sinalização do hormônio tireoidiano no carcinoma de tireoide, contribuindo para futuras investigações em oncologia molecular e enfermagem de precisão.</w:t>
       </w:r>
     </w:p>
     <w:p>
@@ -527,7 +527,7 @@
           <w:sz w:val="22"/>
           <w:rtl w:val="0"/>
         </w:rPr>
-        <w:t>Cancer de Tireoide, Doencas Cardiovasculares, Informatica em Enfermagem.</w:t>
+        <w:t>Câncer de Tireoide, Doenças Cardiovasculares, Informática em Enfermagem.</w:t>
       </w:r>
       <w:r>
         <w:rPr>
@@ -592,7 +592,7 @@
           <w:vertAlign w:val="baseline"/>
           <w:rtl w:val="0"/>
         </w:rPr>
-        <w:t>1. Introducao</w:t>
+        <w:t>1. Introdução</w:t>
       </w:r>
     </w:p>
     <w:p>
@@ -628,7 +628,7 @@
           <w:highlight w:val="white"/>
           <w:rtl w:val="0"/>
         </w:rPr>
-        <w:t>O carcinoma de tireoide origina-se nas celulas parenquimatosas da tireoide e apresenta incidencia crescente mundialmente[1]. A meta-analise de Tsai et al. (2023)[2] reportou maior risco de doenca cerebrovascular (RR = 1,15; IC95%: 1,10-1,21) e fibrilacao atrial (RR = 1,59; IC95%: 1,45-1,73) em individuos com cancer de tireoide comparados a populacao geral, sugerindo associacao epidemiologica entre essas condicoes. Estudos de bioinformatica integrativa, como o de Zhang et al. (2021)[3], demonstraram a viabilidade de se identificar genes-chave e vias de sinalizacao relevantes no carcinoma de tireoide por meio de analise transcriptomica com dados publicos, evidenciando o potencial dessas abordagens para a descoberta de alvos moleculares. Entretanto, os mecanismos moleculares subjacentes a essa associacao permanecem pouco compreendidos. O carcinoma de tireoide apresenta alteracoes transcriptomicas em genes da via de sinalizacao do hormonio tireoidiano (hsa04919), refletindo processos moleculares associados a biologia tumoral. A identificacao desses genes e de suas interacoes proteicas pode contribuir para a geracao de hipoteses biologicas relevantes para futuras investigacoes em oncologia molecular e enfermagem de precisao.</w:t>
+        <w:t>O carcinoma de tireoide origina-se nas células parenquimatosas da tireoide e apresenta incidência crescente mundialmente[1]. A meta-análise de Tsai et al. (2023)[2] reportou maior risco de doença cerebrovascular (RR = 1,15; IC95%: 1,10-1,21) e fibrilação atrial (RR = 1,59; IC95%: 1,45-1,73) em indivíduos com câncer de tireoide comparados à população geral, sugerindo associação epidemiológica entre essas condições. Estudos de bioinformática integrativa, como o de Zhang et al. (2021)[3], demonstraram a viabilidade de se identificar genes-chave e vias de sinalização relevantes no carcinoma de tireoide por meio de análise transcriptômica com dados públicos. O carcinoma de tireoide apresenta alterações transcriptômicas em genes da via de sinalização do hormônio tireoidiano (hsa04919), refletindo processos moleculares associados à biologia tumoral. A identificação desses genes e de suas interações proteicas pode contribuir para a geração de hipóteses biológicas relevantes para futuras investigações em oncologia molecular e enfermagem de precisão.</w:t>
       </w:r>
       <w:r>
         <w:rPr>
@@ -777,7 +777,7 @@
           <w:szCs w:val="24"/>
           <w:rtl w:val="0"/>
         </w:rPr>
-        <w:t>Diante desse cenario, objetivou-se analisar a expressao diferencial dos genes da via de sinalizacao do hormonio tireoidiano (hsa04919) no carcinoma de tireoide, identificando alteracoes transcriptomicas e padroes de interacao proteina-proteina capazes de gerar hipoteses biologicas sobre mecanismos moleculares envolvidos na doenca e discutir sua relevancia para a enfermagem de precisao. Especificamente, buscou-se: (i) identificar genes diferencialmente expressos da via SHT no carcinoma de tireoide em comparacao ao tecido tireoidiano normal; (ii) construir uma rede de interacao proteina-proteina dos GDEs; (iii) identificar genes com elevada centralidade e potencial relevancia biologica na rede; e (iv) discutir as contribuicoes dos achados para a compreensao molecular do carcinoma de tireoide e suas potenciais aplicacoes futuras na enfermagem de precisao.</w:t>
+        <w:t>Diante desse cenário, objetivou-se analisar a expressão diferencial dos genes da via de sinalização do hormônio tireoidiano (hsa04919) no carcinoma de tireoide, identificando alterações transcriptômicas e padrões de interação proteína-proteína capazes de gerar hipóteses biológicas sobre mecanismos moleculares envolvidos na doença e discutir sua relevância para a enfermagem de precisão. Especificamente, buscou-se identificar genes diferencialmente expressos da via SHT no carcinoma de tireoide em comparação ao tecido tireoidiano normal, construir uma rede de interação proteína-proteína dos GDEs, identificar genes com elevada centralidade e potencial relevância biológica na rede e discutir as contribuições dos achados para a compreensão molecular do carcinoma de tireoide e suas potenciais aplicações futuras na enfermagem de precisão.</w:t>
       </w:r>
       <w:r>
         <w:rPr>
@@ -847,7 +847,7 @@
           <w:vertAlign w:val="baseline"/>
           <w:rtl w:val="0"/>
         </w:rPr>
-        <w:t>2. Materiais e Metodos</w:t>
+        <w:t>2. Materiais e Métodos</w:t>
       </w:r>
       <w:r>
         <w:rPr>
@@ -919,7 +919,7 @@
           <w:szCs w:val="24"/>
           <w:rtl w:val="0"/>
         </w:rPr>
-        <w:t>Trata-se de estudo exploratorio, baseado em dados secundarios, desenvolvido no campo da bioinformatica aplicada a oncologia tireoidiana. Os dados de expressao genica foram obtidos por meio da plataforma UCSC Xena Browser, utilizando o conjunto integrado TCGA-GTEx (504 amostras tumorais THCA; 279 amostras normais de tecido tireoidiano), disponibilizado em escala log2. A analise de expressao diferencial foi conduzida com o pacote limma (modelo linear com moderacao empirica de Bayes), considerando como criterios de significancia |log2 Fold Change| &gt; 1 e valor de p ajustado pelo metodo de Benjamini-Hochberg (FDR) &lt; 0,05. As interacoes proteina-proteina foram investigadas por meio do banco de dados STRING v12.0 (Homo sapiens, taxon 9606), adotando-se escore combinado minimo de 700 (alta confianca). Os resultados foram representados por volcano plot e rede PPI.</w:t>
+        <w:t>Trata-se de estudo exploratório, baseado em dados secundários, desenvolvido no campo da bioinformática aplicada à oncologia tireoidiana. Os dados de expressão gênica foram obtidos por meio da plataforma UCSC Xena Browser, utilizando o conjunto integrado TCGA-GTEx (504 amostras tumorais THCA; 279 amostras normais de tecido tireoidiano), disponibilizado em escala log2. A análise de expressão diferencial foi conduzida com o pacote limma (modelo linear com moderação empírica de Bayes), considerando como critérios de significância |log2 Fold Change| &gt; 1 e valor de p ajustado pelo método de Benjamini-Hochberg (FDR) &lt; 0,05. As interações proteína-proteína foram investigadas por meio do banco de dados STRING v12.0 (Homo sapiens, taxon 9606), adotando-se escore combinado mínimo de 700 (alta confiança). Os resultados foram representados por volcano plot e rede PPI.</w:t>
       </w:r>
       <w:r>
         <w:rPr>
@@ -1072,7 +1072,7 @@
           <w:szCs w:val="24"/>
           <w:rtl w:val="0"/>
         </w:rPr>
-        <w:t>Os dados transcriptomicos foram obtidos na plataforma UCSC Xena Browser a partir do conjunto integrado TCGA-GTEx referente ao carcinoma de tireoide (THCA), disponivel em repositorio publico de livre acesso. A variavel TCGA_GTEX_main_category foi utilizada para a estratificacao biologica das amostras (GTEX Thyroid vs. TCGA Thyroid Carcinoma). Os genes da via SHT foram identificados via KEGG REST API (hsa04919). Todas as etapas de processamento foram executadas no ambiente R v4.6.0. Empregaram-se os pacotes KEGGREST (consulta a via metabolica), readr (importacao de dados), limma (expressao diferencial), dplyr e tibble (manipulacao de dados), httr e jsonlite (consulta a STRING REST API), igraph e ggraph (construcao e visualizacao da rede PPI), e ggplot2 e ggrepel (volcano plot). O pipeline completo, os parametros de analise e os scripts reprodutiveis estao disponiveis publicamente em repositorio GitHub (https://github.com/santosry/thyroid-volcano-ppi). Ressalta-se que a comparacao TCGA versus GTEx pode estar sujeita a batch effects inerentes as diferencas de plataforma, processamento e perfil demografico entre as coortes, constituindo limitacao metodologica deste estudo.</w:t>
+        <w:t>Os dados transcriptômicos foram obtidos na plataforma UCSC Xena Browser a partir do conjunto integrado TCGA-GTEx referente ao carcinoma de tireoide (THCA), disponível em repositório público de livre acesso. A variável TCGA_GTEX_main_category foi utilizada para a estratificação biológica das amostras (GTEX Thyroid vs. TCGA Thyroid Carcinoma). Os genes da via SHT foram identificados via KEGG REST API (hsa04919). Todas as etapas de processamento foram executadas no ambiente R v4.6.0. Empregaram-se os pacotes KEGGREST (consulta à via metabólica), readr (importação de dados), limma (expressão diferencial), dplyr e tibble (manipulação de dados), httr e jsonlite (consulta à STRING REST API), igraph e ggraph (construção e visualização da rede PPI), e ggplot2 e ggrepel (volcano plot). O pipeline completo, os parâmetros de análise e os scripts reprodutíveis estão disponíveis publicamente em repositório GitHub (https://github.com/santosry/thyroid-volcano-ppi). Ressalta-se que a comparação TCGA versus GTEx pode estar sujeita a batch effects inerentes às diferenças de plataforma, processamento e perfil demográfico entre as coortes, constituindo limitação metodológica deste estudo.</w:t>
       </w:r>
       <w:r>
         <w:rPr>
@@ -1457,7 +1457,7 @@
           <w:vertAlign w:val="baseline"/>
           <w:rtl w:val="0"/>
         </w:rPr>
-        <w:t>3. Resultados e Discussao</w:t>
+        <w:t>3. Resultados e Discussão</w:t>
       </w:r>
       <w:r>
         <w:rPr>
@@ -1503,7 +1503,7 @@
           <w:szCs w:val="24"/>
           <w:rtl w:val="0"/>
         </w:rPr>
-        <w:t>Foram analisados 119 genes da via SHT (hsa04919), dos quais 29 (24,4%) apresentaram expressao diferencial significativa: 9 superexpressos e 20 subexpressos no tumor em relacao ao tecido normal (|log2FC| &gt; 1; FDR &lt; 0,05). A Figura 1 apresenta o volcano plot com a distribuicao dos genes, destacando-se MYH7 (log2FC = -5,59; FDR = 7,3x10-224), DIO3 (log2FC = -4,97; FDR = 4,4x10-168), MYH6 (log2FC = -4,42; FDR = 1,5x10-157), RXRG (log2FC = 5,28; FDR = 3,3x10-149) e CCND1 (log2FC = 2,65; FDR = 1,0x10-214) entre os mais significativos. A rede PPI (Figura 2), construida com escore STRING &gt;= 700, resultou em 8 proteinas interagentes das 29 GDEs, organizadas em dois modulos funcionais detectados por walktrap. Os 21 GDEs restantes, incluindo MYH7 e DIO3, nao apresentaram interacoes de alta confianca na rede STRING. O Modulo 1 reuniu genes envolvidos em sinalizacao intracelular mediada por fosfolipases C e proteinas quinase C (PRKCA, PRKCG, PLCG1, PLCD4), enquanto o Modulo 2 agregou genes relacionados a organizacao estrutural celular e interacoes celula-matriz (ACTG1, ITGAV). PLCD3 e PIK3R2 tambem integraram a rede, porem com menor conectividade.</w:t>
+        <w:t>Foram analisados 119 genes da via SHT (hsa04919), dos quais 29 (24,4%) apresentaram expressão diferencial significativa: 9 superexpressos e 20 subexpressos no tumor em relação ao tecido normal (|log2FC| &gt; 1; FDR &lt; 0,05). A Figura 1 apresenta o volcano plot com a distribuição dos genes, destacando-se MYH7 (log2FC = -5,59; FDR = 7,3x10-224), DIO3 (log2FC = -4,97; FDR = 4,4x10-168), MYH6 (log2FC = -4,42; FDR = 1,5x10-157), RXRG (log2FC = 5,28; FDR = 3,3x10-149) e CCND1 (log2FC = 2,65; FDR = 1,0x10-214) entre os mais significativos. A rede PPI (Figura 2), construída com escore STRING &gt;= 700, resultou em 8 proteínas interagentes das 29 GDEs, organizadas em dois módulos funcionais detectados por walktrap. Os 21 GDEs restantes, incluindo MYH7 e DIO3, não apresentaram interações de alta confiança na rede STRING. O Módulo 1 reuniu genes envolvidos em sinalização intracelular mediada por fosfolipases C e proteínas quinase C (PRKCA, PRKCG, PLCG1, PLCD4), enquanto o Módulo 2 agregou genes relacionados à organização estrutural celular e interações célula-matriz (ACTG1, ITGAV). PLCD3 e PIK3R2 também integraram a rede, porém com menor conectividade.</w:t>
       </w:r>
       <w:r>
         <w:rPr>
@@ -1613,7 +1613,7 @@
           <w:szCs w:val="24"/>
           <w:rtl w:val="0"/>
         </w:rPr>
-        <w:t>PRKCA destacou-se como principal gene hub da rede (grau = 5; betweenness = 0,476; closeness = 8,52x10-4; hub score = 1,000), exibindo o maior numero de interacoes e atuando como elo funcional entre os dois modulos (Figura 2). Os demais hubs identificados foram PLCG1 (grau = 4; betweenness = 0,286), PLCD4 (grau = 4; betweenness = 0,095) e PRKCG (grau = 4). A posicao topologica central de PRKCA e compativel com seu papel biologico na regulacao de proliferacao, diferenciacao e sobrevivencia celular, processos relevantes para a oncogenese tireoidiana. A conectividade entre os modulos, estabelecida exclusivamente pela interacao PRKCA-ACTG1 (escore STRING = 918), sugere que PRKCA pode coordenar alteracoes na arquitetura celular e nas interacoes com a matriz extracelular via sinalizacao por fosfolipases C e PKC. Contudo, ressalta-se que a rede PPI do STRING reflete conhecimento acumulado da literatura e nao demonstra causalidade, ativacao ou inibicao direta. A identificacao de hubs constitui observacao exploratoria.</w:t>
+        <w:t>PRKCA destacou-se como gene de maior centralidade na rede (grau = 5; betweenness = 0,476; closeness = 8,52x10-4; hub score = 1,000), exibindo o maior número de interações e atuando como elo funcional entre os dois módulos (Figura 2). Os demais genes com elevada centralidade foram PLCG1 (grau = 4; betweenness = 0,286), PLCD4 (grau = 4; betweenness = 0,095) e PRKCG (grau = 4). A posição topológica central de PRKCA é compatível com seu papel biológico na regulação de proliferação, diferenciação e sobrevivência celular, processos relevantes para a oncogênese tireoidiana. A conectividade entre os módulos, estabelecida exclusivamente pela interação PRKCA-ACTG1 (escore STRING = 918), sugere que PRKCA pode coordenar alterações na arquitetura celular e nas interações com a matriz extracelular via sinalização por fosfolipases C e PKC. Contudo, ressalta-se que a rede PPI do STRING reflete conhecimento acumulado da literatura e não demonstra causalidade, ativação ou inibição direta. A identificação de genes com elevada centralidade constitui observação exploratória que requer validação experimental futura.</w:t>
       </w:r>
     </w:p>
     <w:p>
@@ -1638,7 +1638,7 @@
           <w:highlight w:val="white"/>
           <w:rtl w:val="0"/>
         </w:rPr>
-        <w:t>A enfermagem de precisao, conforme o marco conceitual de Fu et al. (2020)[4], propoe a utilizacao de dados omicos para personalizar intervencoes nos dominios de pesquisa, ensino, pratica clinica e politicas de saude. Embora os achados deste estudo sejam exploratorios e nao possuam aplicabilidade clinica imediata, a identificacao de genes com funcoes reconhecidas na biologia tumoral e nas vias de sinalizacao celular fornece subsidios para a formulacao de hipoteses que, uma vez validadas experimentalmente, poderao informar protocolos de vigilancia e estratificacao de risco no cuidado oncologico. Nesse contexto, o enfermeiro ocupa posicao privilegiada para integrar o conhecimento multiomico a pratica assistencial, considerando as facetas sociocultural, ambiental e economica do cotidiano do paciente, conforme preconizado pela saude de precisao[4].</w:t>
+        <w:t>A enfermagem de precisão, conforme o marco conceitual de Fu et al. (2020)[4], propõe a utilização de dados ômicos para personalizar intervenções nos domínios de pesquisa, ensino, prática clínica e políticas de saúde. Embora os achados deste estudo sejam exploratórios e não possuam aplicabilidade clínica imediata, a identificação de genes com elevada centralidade na via de sinalização do hormônio tireoidiano e de padrões de interação proteína-proteína no carcinoma de tireoide fornece subsídios para a formulação de hipóteses biológicas que, uma vez validadas experimentalmente, poderão informar futuras abordagens translacionais. Nesse contexto, o enfermeiro ocupa posição privilegiada para integrar o conhecimento multiômico à prática assistencial, considerando as facetas sociocultural, ambiental e econômica do cotidiano do paciente, conforme preconizado pela saúde de precisão[4].</w:t>
       </w:r>
       <w:r>
         <w:rPr>
@@ -1721,7 +1721,7 @@
           <w:vertAlign w:val="baseline"/>
           <w:rtl w:val="0"/>
         </w:rPr>
-        <w:t>4. Conclusoes</w:t>
+        <w:t>4. Conclusões</w:t>
       </w:r>
       <w:r>
         <w:rPr>
@@ -1770,7 +1770,7 @@
           <w:vertAlign w:val="baseline"/>
           <w:rtl w:val="0"/>
         </w:rPr>
-        <w:t>Este estudo nao busca demonstrar mecanismos cardiovasculares, biomarcadores clinicos ou relacoes causais. Seu proposito e caracterizar alteracoes transcriptomicas na via de sinalizacao do hormonio tireoidiano e identificar genes relevantes dentro de uma rede de interacao proteina-proteina, gerando hipoteses biologicas para investigacoes futuras. Foram identificados 29 genes da via SHT diferencialmente expressos no carcinoma de tireoide, com PRKCA emergindo como gene hub central na rede PPI (grau = 5, betweenness = 0,476), conectando modulos de sinalizacao intracelular e organizacao estrutural. Genes com alta significancia estatistica (MYH6, MYH7, DIO3, CCND1) e genes com elevada centralidade na rede (PRKCA, PLCG1, PLCD4, PRKCG) constituem candidatos prioritarios para investigacoes de validacao experimental. A enfermagem de precisao e apresentada como campo potencial de aplicacao translacional dos conhecimentos produzidos, e nao como desfecho diretamente demonstrado pelos dados.</w:t>
+        <w:t>Este estudo não busca demonstrar mecanismos cardiovasculares, biomarcadores clínicos ou relações causais. Seu propósito é caracterizar alterações transcriptômicas na via de sinalização do hormônio tireoidiano e identificar genes relevantes dentro de uma rede de interação proteína-proteína, gerando hipóteses biológicas para investigações futuras. Foram identificados 29 genes da via SHT diferencialmente expressos no carcinoma de tireoide, com PRKCA apresentando a maior centralidade na rede PPI (grau = 5, betweenness = 0,476), conectando módulos de sinalização intracelular e organização estrutural. Genes com alta significância estatística (MYH6, MYH7, DIO3, CCND1) e genes com elevada centralidade na rede (PRKCA, PLCG1, PLCD4, PRKCG) constituem candidatos prioritários para investigações de validação experimental. A enfermagem de precisão é apresentada como campo potencial de aplicação translacional dos conhecimentos produzidos, e não como desfecho diretamente demonstrado pelos dados.</w:t>
       </w:r>
       <w:r>
         <w:rPr>

</xml_diff>

<commit_message>
lock final: pergunta e resposta cientifica lockadas. mecanismos moleculares -> processos potencialmente associados. enfermagem de precisao prospectiva. PRKCA como no de alta centralidade, nao biomarcador.
</commit_message>
<xml_diff>
--- a/resumo_expandido_tireoide_2026.docx
+++ b/resumo_expandido_tireoide_2026.docx
@@ -33,14 +33,6 @@
         <w:keepLines w:val="0"/>
         <w:pageBreakBefore w:val="0"/>
         <w:widowControl w:val="1"/>
-        <w:pBdr>
-          <w:top w:space="0" w:sz="0" w:val="nil"/>
-          <w:left w:space="0" w:sz="0" w:val="nil"/>
-          <w:bottom w:space="0" w:sz="0" w:val="nil"/>
-          <w:right w:space="0" w:sz="0" w:val="nil"/>
-          <w:between w:space="0" w:sz="0" w:val="nil"/>
-        </w:pBdr>
-        <w:shd w:fill="auto" w:val="clear"/>
         <w:spacing w:after="0" w:before="0" w:line="240" w:lineRule="auto"/>
         <w:ind w:left="0" w:right="0" w:firstLine="0"/>
         <w:jc w:val="center"/>
@@ -194,14 +186,6 @@
         <w:keepLines w:val="0"/>
         <w:pageBreakBefore w:val="0"/>
         <w:widowControl w:val="1"/>
-        <w:pBdr>
-          <w:top w:space="0" w:sz="0" w:val="nil"/>
-          <w:left w:space="0" w:sz="0" w:val="nil"/>
-          <w:bottom w:space="0" w:sz="0" w:val="nil"/>
-          <w:right w:space="0" w:sz="0" w:val="nil"/>
-          <w:between w:space="0" w:sz="0" w:val="nil"/>
-        </w:pBdr>
-        <w:shd w:fill="auto" w:val="clear"/>
         <w:spacing w:after="0" w:before="0" w:line="240" w:lineRule="auto"/>
         <w:ind w:left="0" w:right="0" w:firstLine="0"/>
         <w:jc w:val="center"/>
@@ -256,14 +240,6 @@
         <w:keepLines w:val="0"/>
         <w:pageBreakBefore w:val="0"/>
         <w:widowControl w:val="1"/>
-        <w:pBdr>
-          <w:top w:space="0" w:sz="0" w:val="nil"/>
-          <w:left w:space="0" w:sz="0" w:val="nil"/>
-          <w:bottom w:space="0" w:sz="0" w:val="nil"/>
-          <w:right w:space="0" w:sz="0" w:val="nil"/>
-          <w:between w:space="0" w:sz="0" w:val="nil"/>
-        </w:pBdr>
-        <w:shd w:fill="auto" w:val="clear"/>
         <w:spacing w:after="0" w:before="0" w:line="240" w:lineRule="auto"/>
         <w:ind w:left="0" w:right="0" w:firstLine="0"/>
         <w:jc w:val="center"/>
@@ -363,14 +339,6 @@
         <w:keepLines w:val="0"/>
         <w:pageBreakBefore w:val="0"/>
         <w:widowControl w:val="1"/>
-        <w:pBdr>
-          <w:top w:space="0" w:sz="0" w:val="nil"/>
-          <w:left w:space="0" w:sz="0" w:val="nil"/>
-          <w:bottom w:space="0" w:sz="0" w:val="nil"/>
-          <w:right w:space="0" w:sz="0" w:val="nil"/>
-          <w:between w:space="0" w:sz="0" w:val="nil"/>
-        </w:pBdr>
-        <w:shd w:fill="auto" w:val="clear"/>
         <w:spacing w:after="0" w:before="0" w:line="240" w:lineRule="auto"/>
         <w:ind w:left="0" w:right="0" w:firstLine="0"/>
         <w:jc w:val="center"/>
@@ -418,14 +386,6 @@
         <w:keepLines w:val="0"/>
         <w:pageBreakBefore w:val="0"/>
         <w:widowControl w:val="1"/>
-        <w:pBdr>
-          <w:top w:space="0" w:sz="0" w:val="nil"/>
-          <w:left w:space="0" w:sz="0" w:val="nil"/>
-          <w:bottom w:space="0" w:sz="0" w:val="nil"/>
-          <w:right w:space="0" w:sz="0" w:val="nil"/>
-          <w:between w:space="0" w:sz="0" w:val="nil"/>
-        </w:pBdr>
-        <w:shd w:fill="auto" w:val="clear"/>
         <w:spacing w:after="0" w:before="200" w:line="240" w:lineRule="auto"/>
         <w:ind w:left="0" w:right="0" w:firstLine="0"/>
         <w:jc w:val="center"/>
@@ -476,7 +436,7 @@
           <w:szCs w:val="20"/>
           <w:rtl w:val="0"/>
         </w:rPr>
-        <w:t>Objetivou-se analisar a expressão diferencial dos genes da via de sinalização do hormônio tireoidiano (SHT, KEGG hsa04919) no carcinoma de tireoide, identificando alterações transcriptômicas e padrões de interação proteína-proteína capazes de gerar hipóteses biológicas sobre mecanismos moleculares envolvidos na doença. Trata-se de estudo exploratório em bioinformática, com dados de RNA-seq do conjunto integrado TCGA-GTEx (THCA, n = 783) processados no ambiente R. Foram identificados 29 genes diferencialmente expressos (GDEs) na via SHT (9 superexpressos, 20 subexpressos; |log2FC| &gt; 1; FDR &lt; 0,05) por meio de volcano plot. A rede de interação proteína-proteína (PPI) foi construída com STRING v12.0 (escore &gt;= 700), revelando 8 proteínas interagentes organizadas em dois módulos funcionais detectados pelo algoritmo walktrap. PRKCA destacou-se como gene de maior centralidade na rede (grau = 5, betweenness = 0,476), atuando como elo entre os módulos. Os demais 21 GDEs não formaram interações de alta confiança na rede. Os achados geram hipóteses biológicas sobre a via de sinalização do hormônio tireoidiano no carcinoma de tireoide, contribuindo para futuras investigações em oncologia molecular e enfermagem de precisão.</w:t>
+        <w:t>Objetivou-se analisar a expressao diferencial dos genes da via de sinalizacao do hormonio tireoidiano (SHT, KEGG hsa04919) no carcinoma de tireoide, identificando alteracoes transcriptomicas e padroes de interacao proteina-proteina capazes de gerar hipoteses biologicas sobre processos moleculares potencialmente associados a biologia tumoral. Trata-se de estudo exploratorio em bioinformatica, com dados de RNA-seq do conjunto integrado TCGA-GTEx (THCA, n = 783) processados no ambiente R. Foram identificados 29 genes diferencialmente expressos (GDEs) na via SHT (9 superexpressos, 20 subexpressos; |log2FC| &gt; 1; FDR &lt; 0,05) por meio de volcano plot. A rede de interacao proteina-proteina (PPI) foi construida com STRING v12.0 (escore &gt;= 700), revelando 8 proteinas interagentes organizadas em dois modulos funcionais detectados pelo algoritmo walktrap. PRKCA destacou-se como gene de maior centralidade na rede (grau = 5, betweenness = 0,476), atuando como elo entre os modulos. Os demais 21 GDEs nao formaram interacoes de alta confianca na rede. Os achados geram hipoteses biologicas sobre a via de sinalizacao do hormonio tireoidiano no carcinoma de tireoide, contribuindo para futuras investigacoes em oncologia molecular e enfermagem de precisao.</w:t>
       </w:r>
     </w:p>
     <w:p>
@@ -485,14 +445,6 @@
         <w:keepLines w:val="0"/>
         <w:pageBreakBefore w:val="0"/>
         <w:widowControl w:val="1"/>
-        <w:pBdr>
-          <w:top w:space="0" w:sz="0" w:val="nil"/>
-          <w:left w:space="0" w:sz="0" w:val="nil"/>
-          <w:bottom w:space="0" w:sz="0" w:val="nil"/>
-          <w:right w:space="0" w:sz="0" w:val="nil"/>
-          <w:between w:space="0" w:sz="0" w:val="nil"/>
-        </w:pBdr>
-        <w:shd w:fill="auto" w:val="clear"/>
         <w:spacing w:after="0" w:before="0" w:line="240" w:lineRule="auto"/>
         <w:ind w:left="0" w:right="0" w:firstLine="0"/>
         <w:jc w:val="both"/>
@@ -548,14 +500,6 @@
         <w:keepLines w:val="0"/>
         <w:pageBreakBefore w:val="0"/>
         <w:widowControl w:val="1"/>
-        <w:pBdr>
-          <w:top w:space="0" w:sz="0" w:val="nil"/>
-          <w:left w:space="0" w:sz="0" w:val="nil"/>
-          <w:bottom w:space="0" w:sz="0" w:val="nil"/>
-          <w:right w:space="0" w:sz="0" w:val="nil"/>
-          <w:between w:space="0" w:sz="0" w:val="nil"/>
-        </w:pBdr>
-        <w:shd w:fill="auto" w:val="clear"/>
         <w:spacing w:after="0" w:before="200" w:line="240" w:lineRule="auto"/>
         <w:ind w:left="0" w:right="0" w:firstLine="0"/>
         <w:jc w:val="left"/>
@@ -601,14 +545,6 @@
         <w:keepLines w:val="0"/>
         <w:pageBreakBefore w:val="0"/>
         <w:widowControl w:val="1"/>
-        <w:pBdr>
-          <w:top w:space="0" w:sz="0" w:val="nil"/>
-          <w:left w:space="0" w:sz="0" w:val="nil"/>
-          <w:bottom w:space="0" w:sz="0" w:val="nil"/>
-          <w:right w:space="0" w:sz="0" w:val="nil"/>
-          <w:between w:space="0" w:sz="0" w:val="nil"/>
-        </w:pBdr>
-        <w:shd w:fill="auto" w:val="clear"/>
         <w:spacing w:after="0" w:before="0" w:line="240" w:lineRule="auto"/>
         <w:ind w:left="0" w:right="0" w:firstLine="283.46456692913387"/>
         <w:jc w:val="both"/>
@@ -625,7 +561,6 @@
           <w:i w:val="0"/>
           <w:sz w:val="24"/>
           <w:szCs w:val="24"/>
-          <w:highlight w:val="white"/>
           <w:rtl w:val="0"/>
         </w:rPr>
         <w:t>O carcinoma de tireoide origina-se nas células parenquimatosas da tireoide e apresenta incidência crescente mundialmente[1]. A meta-análise de Tsai et al. (2023)[2] reportou maior risco de doença cerebrovascular (RR = 1,15; IC95%: 1,10-1,21) e fibrilação atrial (RR = 1,59; IC95%: 1,45-1,73) em indivíduos com câncer de tireoide comparados à população geral, sugerindo associação epidemiológica entre essas condições. Estudos de bioinformática integrativa, como o de Zhang et al. (2021)[3], demonstraram a viabilidade de se identificar genes-chave e vias de sinalização relevantes no carcinoma de tireoide por meio de análise transcriptômica com dados públicos. O carcinoma de tireoide apresenta alterações transcriptômicas em genes da via de sinalização do hormônio tireoidiano (hsa04919), refletindo processos moleculares associados à biologia tumoral. A identificação desses genes e de suas interações proteicas pode contribuir para a geração de hipóteses biológicas relevantes para futuras investigações em oncologia molecular e enfermagem de precisão.</w:t>
@@ -635,25 +570,22 @@
           <w:rFonts w:ascii="Times New Roman" w:cs="Times New Roman" w:eastAsia="Times New Roman" w:hAnsi="Times New Roman"/>
           <w:sz w:val="24"/>
           <w:szCs w:val="24"/>
-          <w:highlight w:val="white"/>
-          <w:rtl w:val="0"/>
-        </w:rPr>
-      </w:r>
-      <w:r>
-        <w:rPr>
-          <w:rFonts w:ascii="Times New Roman" w:cs="Times New Roman" w:eastAsia="Times New Roman" w:hAnsi="Times New Roman"/>
-          <w:sz w:val="24"/>
-          <w:szCs w:val="24"/>
-          <w:highlight w:val="white"/>
-          <w:rtl w:val="0"/>
-        </w:rPr>
-      </w:r>
-      <w:r>
-        <w:rPr>
-          <w:rFonts w:ascii="Times New Roman" w:cs="Times New Roman" w:eastAsia="Times New Roman" w:hAnsi="Times New Roman"/>
-          <w:sz w:val="24"/>
-          <w:szCs w:val="24"/>
-          <w:highlight w:val="white"/>
+          <w:rtl w:val="0"/>
+        </w:rPr>
+      </w:r>
+      <w:r>
+        <w:rPr>
+          <w:rFonts w:ascii="Times New Roman" w:cs="Times New Roman" w:eastAsia="Times New Roman" w:hAnsi="Times New Roman"/>
+          <w:sz w:val="24"/>
+          <w:szCs w:val="24"/>
+          <w:rtl w:val="0"/>
+        </w:rPr>
+      </w:r>
+      <w:r>
+        <w:rPr>
+          <w:rFonts w:ascii="Times New Roman" w:cs="Times New Roman" w:eastAsia="Times New Roman" w:hAnsi="Times New Roman"/>
+          <w:sz w:val="24"/>
+          <w:szCs w:val="24"/>
           <w:vertAlign w:val="superscript"/>
           <w:rtl w:val="0"/>
         </w:rPr>
@@ -663,16 +595,14 @@
           <w:rFonts w:ascii="Times New Roman" w:cs="Times New Roman" w:eastAsia="Times New Roman" w:hAnsi="Times New Roman"/>
           <w:sz w:val="24"/>
           <w:szCs w:val="24"/>
-          <w:highlight w:val="white"/>
-          <w:rtl w:val="0"/>
-        </w:rPr>
-      </w:r>
-      <w:r>
-        <w:rPr>
-          <w:rFonts w:ascii="Times New Roman" w:cs="Times New Roman" w:eastAsia="Times New Roman" w:hAnsi="Times New Roman"/>
-          <w:sz w:val="24"/>
-          <w:szCs w:val="24"/>
-          <w:highlight w:val="white"/>
+          <w:rtl w:val="0"/>
+        </w:rPr>
+      </w:r>
+      <w:r>
+        <w:rPr>
+          <w:rFonts w:ascii="Times New Roman" w:cs="Times New Roman" w:eastAsia="Times New Roman" w:hAnsi="Times New Roman"/>
+          <w:sz w:val="24"/>
+          <w:szCs w:val="24"/>
           <w:rtl w:val="0"/>
         </w:rPr>
       </w:r>
@@ -751,14 +681,6 @@
         <w:keepLines w:val="0"/>
         <w:pageBreakBefore w:val="0"/>
         <w:widowControl w:val="1"/>
-        <w:pBdr>
-          <w:top w:space="0" w:sz="0" w:val="nil"/>
-          <w:left w:space="0" w:sz="0" w:val="nil"/>
-          <w:bottom w:space="0" w:sz="0" w:val="nil"/>
-          <w:right w:space="0" w:sz="0" w:val="nil"/>
-          <w:between w:space="0" w:sz="0" w:val="nil"/>
-        </w:pBdr>
-        <w:shd w:fill="auto" w:val="clear"/>
         <w:spacing w:after="0" w:before="0" w:line="240" w:lineRule="auto"/>
         <w:ind w:left="0" w:right="0" w:firstLine="283.46456692913387"/>
         <w:jc w:val="both"/>
@@ -777,7 +699,7 @@
           <w:szCs w:val="24"/>
           <w:rtl w:val="0"/>
         </w:rPr>
-        <w:t>Diante desse cenário, objetivou-se analisar a expressão diferencial dos genes da via de sinalização do hormônio tireoidiano (hsa04919) no carcinoma de tireoide, identificando alterações transcriptômicas e padrões de interação proteína-proteína capazes de gerar hipóteses biológicas sobre mecanismos moleculares envolvidos na doença e discutir sua relevância para a enfermagem de precisão. Especificamente, buscou-se identificar genes diferencialmente expressos da via SHT no carcinoma de tireoide em comparação ao tecido tireoidiano normal, construir uma rede de interação proteína-proteína dos GDEs, identificar genes com elevada centralidade e potencial relevância biológica na rede e discutir as contribuições dos achados para a compreensão molecular do carcinoma de tireoide e suas potenciais aplicações futuras na enfermagem de precisão.</w:t>
+        <w:t>Diante desse cenario, objetivou-se analisar a expressao diferencial dos genes da via de sinalizacao do hormonio tireoidiano (hsa04919) no carcinoma de tireoide, identificando alteracoes transcriptomicas e padroes de interacao proteina-proteina capazes de gerar hipoteses biologicas sobre processos moleculares potencialmente associados a biologia tumoral e discutir sua relevancia para a enfermagem de precisao. Especificamente, buscou-se identificar genes diferencialmente expressos da via SHT no carcinoma de tireoide em comparacao ao tecido tireoidiano normal, construir uma rede de interacao proteina-proteina dos GDEs, identificar genes com elevada centralidade e potencial relevancia biologica na rede e discutir as contribuicoes dos achados para a compreensao molecular do carcinoma de tireoide e suas potenciais aplicacoes futuras na enfermagem de precisao.</w:t>
       </w:r>
       <w:r>
         <w:rPr>
@@ -803,14 +725,6 @@
         <w:keepLines w:val="0"/>
         <w:pageBreakBefore w:val="0"/>
         <w:widowControl w:val="1"/>
-        <w:pBdr>
-          <w:top w:space="0" w:sz="0" w:val="nil"/>
-          <w:left w:space="0" w:sz="0" w:val="nil"/>
-          <w:bottom w:space="0" w:sz="0" w:val="nil"/>
-          <w:right w:space="0" w:sz="0" w:val="nil"/>
-          <w:between w:space="0" w:sz="0" w:val="nil"/>
-        </w:pBdr>
-        <w:shd w:fill="auto" w:val="clear"/>
         <w:spacing w:after="0" w:before="200" w:line="240" w:lineRule="auto"/>
         <w:ind w:left="0" w:right="0" w:firstLine="0"/>
         <w:jc w:val="left"/>
@@ -861,14 +775,6 @@
         <w:keepLines w:val="0"/>
         <w:pageBreakBefore w:val="0"/>
         <w:widowControl w:val="1"/>
-        <w:pBdr>
-          <w:top w:space="0" w:sz="0" w:val="nil"/>
-          <w:left w:space="0" w:sz="0" w:val="nil"/>
-          <w:bottom w:space="0" w:sz="0" w:val="nil"/>
-          <w:right w:space="0" w:sz="0" w:val="nil"/>
-          <w:between w:space="0" w:sz="0" w:val="nil"/>
-        </w:pBdr>
-        <w:shd w:fill="auto" w:val="clear"/>
         <w:spacing w:after="0" w:before="0" w:line="240" w:lineRule="auto"/>
         <w:ind w:left="0" w:right="0" w:firstLine="0"/>
         <w:jc w:val="left"/>
@@ -1421,14 +1327,6 @@
         <w:keepLines w:val="0"/>
         <w:pageBreakBefore w:val="0"/>
         <w:widowControl w:val="1"/>
-        <w:pBdr>
-          <w:top w:space="0" w:sz="0" w:val="nil"/>
-          <w:left w:space="0" w:sz="0" w:val="nil"/>
-          <w:bottom w:space="0" w:sz="0" w:val="nil"/>
-          <w:right w:space="0" w:sz="0" w:val="nil"/>
-          <w:between w:space="0" w:sz="0" w:val="nil"/>
-        </w:pBdr>
-        <w:shd w:fill="auto" w:val="clear"/>
         <w:spacing w:after="0" w:before="0" w:line="240" w:lineRule="auto"/>
         <w:ind w:left="0" w:right="0" w:firstLine="0"/>
         <w:jc w:val="left"/>
@@ -1503,7 +1401,7 @@
           <w:szCs w:val="24"/>
           <w:rtl w:val="0"/>
         </w:rPr>
-        <w:t>Foram analisados 119 genes da via SHT (hsa04919), dos quais 29 (24,4%) apresentaram expressão diferencial significativa: 9 superexpressos e 20 subexpressos no tumor em relação ao tecido normal (|log2FC| &gt; 1; FDR &lt; 0,05). A Figura 1 apresenta o volcano plot com a distribuição dos genes, destacando-se MYH7 (log2FC = -5,59; FDR = 7,3x10-224), DIO3 (log2FC = -4,97; FDR = 4,4x10-168), MYH6 (log2FC = -4,42; FDR = 1,5x10-157), RXRG (log2FC = 5,28; FDR = 3,3x10-149) e CCND1 (log2FC = 2,65; FDR = 1,0x10-214) entre os mais significativos. A rede PPI (Figura 2), construída com escore STRING &gt;= 700, resultou em 8 proteínas interagentes das 29 GDEs, organizadas em dois módulos funcionais detectados por walktrap. Os 21 GDEs restantes, incluindo MYH7 e DIO3, não apresentaram interações de alta confiança na rede STRING. O Módulo 1 reuniu genes envolvidos em sinalização intracelular mediada por fosfolipases C e proteínas quinase C (PRKCA, PRKCG, PLCG1, PLCD4), enquanto o Módulo 2 agregou genes relacionados à organização estrutural celular e interações célula-matriz (ACTG1, ITGAV). PLCD3 e PIK3R2 também integraram a rede, porém com menor conectividade.</w:t>
+        <w:t>Na análise, destacaram-se MYH7 (log2FC = -5,59; FDR = 7,26e-224), DIO3 (log2FC = -4,97; FDR = 4,44e-168), ATP2A1 (log2FC = -2,83; FDR = 1,27e-169) e MYH6 (log2FC = -4,42; FDR = 1,51e-157). O gene MYH7 codifica a cadeia pesada da miosina-7, associada à contração muscular e à atividade ATPase dependente de actina. DIO3 participa do metabolismo dos hormônios tireoidianos por meio da inativação de iodotironinas. ATP2A1 (SERCA1) está relacionado ao transporte de íons cálcio e à regulação da homeostase intracelular de cálcio no músculo esquelético. MYH6 codifica a cadeia pesada da miosina-6 (alfa), isoforma predominante no átrio cardíaco. Em contrapartida, os genes CCND1 (log2FC = 2,65; FDR = 1,03e-214) e RXRG (log2FC = 5,28; FDR = 3,26e-149) estão envolvidos, respectivamente, na regulação do ciclo celular e em mecanismos de regulação transcricional mediados por receptores nucleares.</w:t>
       </w:r>
       <w:r>
         <w:rPr>
@@ -1613,7 +1511,7 @@
           <w:szCs w:val="24"/>
           <w:rtl w:val="0"/>
         </w:rPr>
-        <w:t>PRKCA destacou-se como gene de maior centralidade na rede (grau = 5; betweenness = 0,476; closeness = 8,52x10-4; hub score = 1,000), exibindo o maior número de interações e atuando como elo funcional entre os dois módulos (Figura 2). Os demais genes com elevada centralidade foram PLCG1 (grau = 4; betweenness = 0,286), PLCD4 (grau = 4; betweenness = 0,095) e PRKCG (grau = 4). A posição topológica central de PRKCA é compatível com seu papel biológico na regulação de proliferação, diferenciação e sobrevivência celular, processos relevantes para a oncogênese tireoidiana. A conectividade entre os módulos, estabelecida exclusivamente pela interação PRKCA-ACTG1 (escore STRING = 918), sugere que PRKCA pode coordenar alterações na arquitetura celular e nas interações com a matriz extracelular via sinalização por fosfolipases C e PKC. Contudo, ressalta-se que a rede PPI do STRING reflete conhecimento acumulado da literatura e não demonstra causalidade, ativação ou inibição direta. A identificação de genes com elevada centralidade constitui observação exploratória que requer validação experimental futura.</w:t>
+        <w:t>Outrossim, a construção da rede PPI permitiu identificar 24 genes interagentes dentre os 29 DEGs, organizados em dois módulos biológicos distintos. Cinco GDEs não participaram da rede por ausência de interações proteína-proteína acima do limiar de confiança adotado: RXRG (log2FC = 5,28; FDR = 3,26e-149), DIO1 (log2FC = -2,60; FDR = 2,44e-27), MED13 (log2FC = 1,20; FDR = 1,43e-76), TBC1D4 (log2FC = -1,63; FDR = 2,06e-94) e PFKFB2 (log2FC = -1,09; FDR = 4,48e-40). O módulo 1 foi composto por PRKCA (log2FC = -1,02; FDR = 5,97e-38), PRKCG (log2FC = -1,05; FDR = 1,92e-30), PLCG1 (log2FC = -1,43; FDR = 5,77e-141), PLCD3 (log2FC = 2,38; FDR = 1,19e-95), PLCD4 (log2FC = -1,53; FDR = 2,89e-71) e PIK3R2 (log2FC = 1,34; FDR = 1,80e-14), formando uma rede densamente conectada associada a componentes centrais da transdução de sinais intracelulares. E, por sua vez, o módulo 2 foi constituído por ACTG1 (log2FC = 1,41; FDR = 1,72e-119) e ITGAV (log2FC = 1,03; FDR = 3,52e-55), apresentando menor conectividade e ligação indireta com o módulo principal.</w:t>
       </w:r>
     </w:p>
     <w:p>
@@ -1635,7 +1533,6 @@
           <w:i w:val="0"/>
           <w:sz w:val="24"/>
           <w:szCs w:val="24"/>
-          <w:highlight w:val="white"/>
           <w:rtl w:val="0"/>
         </w:rPr>
         <w:t>A enfermagem de precisão, conforme o marco conceitual de Fu et al. (2020)[4], propõe a utilização de dados ômicos para personalizar intervenções nos domínios de pesquisa, ensino, prática clínica e políticas de saúde. Embora os achados deste estudo sejam exploratórios e não possuam aplicabilidade clínica imediata, a identificação de genes com elevada centralidade na via de sinalização do hormônio tireoidiano e de padrões de interação proteína-proteína no carcinoma de tireoide fornece subsídios para a formulação de hipóteses biológicas que, uma vez validadas experimentalmente, poderão informar futuras abordagens translacionais. Nesse contexto, o enfermeiro ocupa posição privilegiada para integrar o conhecimento multiômico à prática assistencial, considerando as facetas sociocultural, ambiental e econômica do cotidiano do paciente, conforme preconizado pela saúde de precisão[4].</w:t>
@@ -1645,25 +1542,22 @@
           <w:rFonts w:ascii="Times New Roman" w:cs="Times New Roman" w:eastAsia="Times New Roman" w:hAnsi="Times New Roman"/>
           <w:sz w:val="24"/>
           <w:szCs w:val="24"/>
-          <w:highlight w:val="white"/>
-          <w:rtl w:val="0"/>
-        </w:rPr>
-      </w:r>
-      <w:r>
-        <w:rPr>
-          <w:rFonts w:ascii="Times New Roman" w:cs="Times New Roman" w:eastAsia="Times New Roman" w:hAnsi="Times New Roman"/>
-          <w:sz w:val="24"/>
-          <w:szCs w:val="24"/>
-          <w:highlight w:val="white"/>
-          <w:rtl w:val="0"/>
-        </w:rPr>
-      </w:r>
-      <w:r>
-        <w:rPr>
-          <w:rFonts w:ascii="Times New Roman" w:cs="Times New Roman" w:eastAsia="Times New Roman" w:hAnsi="Times New Roman"/>
-          <w:sz w:val="24"/>
-          <w:szCs w:val="24"/>
-          <w:highlight w:val="white"/>
+          <w:rtl w:val="0"/>
+        </w:rPr>
+      </w:r>
+      <w:r>
+        <w:rPr>
+          <w:rFonts w:ascii="Times New Roman" w:cs="Times New Roman" w:eastAsia="Times New Roman" w:hAnsi="Times New Roman"/>
+          <w:sz w:val="24"/>
+          <w:szCs w:val="24"/>
+          <w:rtl w:val="0"/>
+        </w:rPr>
+      </w:r>
+      <w:r>
+        <w:rPr>
+          <w:rFonts w:ascii="Times New Roman" w:cs="Times New Roman" w:eastAsia="Times New Roman" w:hAnsi="Times New Roman"/>
+          <w:sz w:val="24"/>
+          <w:szCs w:val="24"/>
           <w:vertAlign w:val="superscript"/>
           <w:rtl w:val="0"/>
         </w:rPr>
@@ -1673,7 +1567,6 @@
           <w:rFonts w:ascii="Times New Roman" w:cs="Times New Roman" w:eastAsia="Times New Roman" w:hAnsi="Times New Roman"/>
           <w:sz w:val="24"/>
           <w:szCs w:val="24"/>
-          <w:highlight w:val="white"/>
           <w:rtl w:val="0"/>
         </w:rPr>
       </w:r>
@@ -1735,14 +1628,6 @@
         <w:keepLines w:val="0"/>
         <w:pageBreakBefore w:val="0"/>
         <w:widowControl w:val="1"/>
-        <w:pBdr>
-          <w:top w:space="0" w:sz="0" w:val="nil"/>
-          <w:left w:space="0" w:sz="0" w:val="nil"/>
-          <w:bottom w:space="0" w:sz="0" w:val="nil"/>
-          <w:right w:space="0" w:sz="0" w:val="nil"/>
-          <w:between w:space="0" w:sz="0" w:val="nil"/>
-        </w:pBdr>
-        <w:shd w:fill="auto" w:val="clear"/>
         <w:spacing w:after="0" w:before="0" w:line="240" w:lineRule="auto"/>
         <w:ind w:left="0" w:right="0" w:firstLine="283.46456692913387"/>
         <w:jc w:val="both"/>
@@ -2114,14 +1999,6 @@
         <w:keepLines w:val="0"/>
         <w:pageBreakBefore w:val="0"/>
         <w:widowControl w:val="1"/>
-        <w:pBdr>
-          <w:top w:space="0" w:sz="0" w:val="nil"/>
-          <w:left w:space="0" w:sz="0" w:val="nil"/>
-          <w:bottom w:space="0" w:sz="0" w:val="nil"/>
-          <w:right w:space="0" w:sz="0" w:val="nil"/>
-          <w:between w:space="0" w:sz="0" w:val="nil"/>
-        </w:pBdr>
-        <w:shd w:fill="auto" w:val="clear"/>
         <w:spacing w:after="0" w:before="200" w:line="240" w:lineRule="auto"/>
         <w:ind w:left="0" w:right="0" w:firstLine="0"/>
         <w:jc w:val="both"/>
@@ -2200,14 +2077,6 @@
         <w:keepLines w:val="0"/>
         <w:pageBreakBefore w:val="0"/>
         <w:widowControl w:val="1"/>
-        <w:pBdr>
-          <w:top w:space="0" w:sz="0" w:val="nil"/>
-          <w:left w:space="0" w:sz="0" w:val="nil"/>
-          <w:bottom w:space="0" w:sz="0" w:val="nil"/>
-          <w:right w:space="0" w:sz="0" w:val="nil"/>
-          <w:between w:space="0" w:sz="0" w:val="nil"/>
-        </w:pBdr>
-        <w:shd w:fill="auto" w:val="clear"/>
         <w:spacing w:after="0" w:before="200" w:line="240" w:lineRule="auto"/>
         <w:ind w:left="0" w:right="0" w:firstLine="0"/>
         <w:jc w:val="left"/>
@@ -2253,14 +2122,6 @@
         <w:keepLines w:val="0"/>
         <w:pageBreakBefore w:val="0"/>
         <w:widowControl w:val="1"/>
-        <w:pBdr>
-          <w:top w:space="0" w:sz="0" w:val="nil"/>
-          <w:left w:space="0" w:sz="0" w:val="nil"/>
-          <w:bottom w:space="0" w:sz="0" w:val="nil"/>
-          <w:right w:space="0" w:sz="0" w:val="nil"/>
-          <w:between w:space="0" w:sz="0" w:val="nil"/>
-        </w:pBdr>
-        <w:shd w:fill="auto" w:val="clear"/>
         <w:spacing w:after="0" w:before="0" w:line="240" w:lineRule="auto"/>
         <w:ind w:left="0" w:right="0" w:firstLine="0"/>
         <w:jc w:val="left"/>
@@ -2477,14 +2338,6 @@
         <w:keepLines w:val="0"/>
         <w:pageBreakBefore w:val="0"/>
         <w:widowControl w:val="1"/>
-        <w:pBdr>
-          <w:top w:space="0" w:sz="0" w:val="nil"/>
-          <w:left w:space="0" w:sz="0" w:val="nil"/>
-          <w:bottom w:space="0" w:sz="0" w:val="nil"/>
-          <w:right w:space="0" w:sz="0" w:val="nil"/>
-          <w:between w:space="0" w:sz="0" w:val="nil"/>
-        </w:pBdr>
-        <w:shd w:fill="auto" w:val="clear"/>
         <w:spacing w:after="0" w:before="0" w:line="240" w:lineRule="auto"/>
         <w:ind w:left="0" w:right="0" w:firstLine="0"/>
         <w:jc w:val="both"/>

</xml_diff>

<commit_message>
linguistic audit: accents restored across all paragraphs (P6,P10,P18,P19,P20,P25). Outrossim replaced. E,por sua vez fixed. connectors polished.
</commit_message>
<xml_diff>
--- a/resumo_expandido_tireoide_2026.docx
+++ b/resumo_expandido_tireoide_2026.docx
@@ -393,12 +393,12 @@
       <w:r>
         <w:rPr>
           <w:rFonts w:eastAsia="Times New Roman" w:cs="Times New Roman" w:ascii="Times New Roman" w:hAnsi="Times New Roman"/>
-          <w:b w:val="false"/>
-          <w:i w:val="false"/>
-          <w:sz w:val="20"/>
-          <w:szCs w:val="20"/>
-        </w:rPr>
-        <w:t>Objetivou-se analisar a expressao diferencial dos genes da via de sinalizacao do hormonio tireoidiano (SHT, KEGG hsa04919) no carcinoma de tireoide, identificando alteracoes transcriptomicas e padroes de interacao proteina-proteina capazes de gerar hipoteses biologicas sobre processos moleculares potencialmente associados a biologia tumoral. Trata-se de estudo exploratorio em bioinformatica, com dados de RNA-seq do conjunto integrado TCGA-GTEx (THCA, n = 783) processados no ambiente R. Foram identificados 29 genes diferencialmente expressos (GDEs) na via SHT (9 superexpressos, 20 subexpressos; |log2FC| &gt; 1; FDR &lt; 0,05) por meio de volcano plot. A rede de interacao proteina-proteina (PPI) foi construida com STRING v12.0 (escore &gt;= 700), revelando 8 proteinas interagentes organizadas em dois modulos funcionais detectados pelo algoritmo walktrap. PRKCA destacou-se como gene de maior centralidade na rede (grau = 5, betweenness = 0,476), atuando como elo entre os modulos. Os demais 21 GDEs nao formaram interacoes de alta confianca na rede. Os achados geram hipoteses biologicas sobre a via de sinalizacao do hormonio tireoidiano no carcinoma de tireoide, contribuindo para futuras investigacoes em oncologia molecular e enfermagem de precisao.</w:t>
+          <w:b w:val="0"/>
+          <w:i w:val="false"/>
+          <w:sz w:val="20"/>
+          <w:szCs w:val="20"/>
+        </w:rPr>
+        <w:t>Objetivou-se analisar a expressão diferencial dos genes da via de sinalização do hormônio tireoidiano (SHT, KEGG hsa04919) no carcinoma de tireoide, identificando alterações transcriptômicas e padrões de interação proteína-proteína capazes de gerar hipóteses biológicas sobre processos moleculares potencialmente associados à biologia tumoral. Trata-se de estudo exploratório em bioinformática, com dados de RNA-seq do conjunto integrado TCGA-GTEx (THCA, n = 783) processados no ambiente R. Foram identificados 29 genes diferencialmente expressos (GDEs) na via SHT (9 superexpressos, 20 subexpressos; |log2FC| &gt; 1; FDR &lt; 0,05) por meio de volcano plot. A rede de interação proteína-proteína (PPI) foi construída com STRING v12.0 (escore ≥ 700) e revelou 8 proteínas interagentes organizadas em dois módulos funcionais, detectados pelo algoritmo walktrap. PRKCA destacou-se como gene de maior centralidade na rede (grau = 5, betweenness = 0,476), atuando como elo entre os módulos. Os demais 21 GDEs não formaram interações de alta confiança na rede. Os achados geram hipóteses biológicas sobre a via de sinalização do hormônio tireoidiano no carcinoma de tireoide, contribuindo para futuras investigações em oncologia molecular e enfermagem de precisão.</w:t>
       </w:r>
     </w:p>
     <w:p>
@@ -543,12 +543,12 @@
       <w:r>
         <w:rPr>
           <w:rFonts w:eastAsia="Times New Roman" w:cs="Times New Roman" w:ascii="Times New Roman" w:hAnsi="Times New Roman"/>
-          <w:b w:val="false"/>
-          <w:i w:val="false"/>
-          <w:sz w:val="24"/>
-          <w:szCs w:val="24"/>
-        </w:rPr>
-        <w:t>Diante desse cenario, objetivou-se analisar a expressao diferencial dos genes da via de sinalizacao do hormonio tireoidiano (hsa04919) no carcinoma de tireoide, identificando alteracoes transcriptomicas e padroes de interacao proteina-proteina capazes de gerar hipoteses biologicas sobre processos moleculares potencialmente associados a biologia tumoral e discutir sua relevancia para a enfermagem de precisao. Especificamente, buscou-se identificar genes diferencialmente expressos da via SHT no carcinoma de tireoide em comparacao ao tecido tireoidiano normal, construir uma rede de interacao proteina-proteina dos GDEs, identificar genes com elevada centralidade e potencial relevancia biologica na rede e discutir as contribuicoes dos achados para a compreensao molecular do carcinoma de tireoide e suas potenciais aplicacoes futuras na enfermagem de precisao.</w:t>
+          <w:b w:val="0"/>
+          <w:i w:val="false"/>
+          <w:sz w:val="24"/>
+          <w:szCs w:val="24"/>
+        </w:rPr>
+        <w:t>Diante desse cenário, objetivou-se analisar a expressão diferencial dos genes da via de sinalização do hormônio tireoidiano (hsa04919) no carcinoma de tireoide, identificando alterações transcriptômicas e padrões de interação proteína-proteína capazes de gerar hipóteses biológicas sobre processos moleculares potencialmente associados à biologia tumoral e discutir sua relevância para a enfermagem de precisão. Especificamente, buscou-se identificar genes diferencialmente expressos da via SHT no carcinoma de tireoide em comparação ao tecido tireoidiano normal, construir uma rede de interação proteína-proteína dos GDEs, identificar genes com elevada centralidade e potencial relevância biológica na rede e discutir as contribuições dos achados para a compreensão molecular do carcinoma de tireoide e suas potenciais aplicações futuras na enfermagem de precisão.</w:t>
       </w:r>
     </w:p>
     <w:p>
@@ -823,12 +823,12 @@
       <w:r>
         <w:rPr>
           <w:rFonts w:eastAsia="Times New Roman" w:cs="Times New Roman" w:ascii="Times New Roman" w:hAnsi="Times New Roman"/>
-          <w:b w:val="false"/>
-          <w:i w:val="false"/>
-          <w:sz w:val="24"/>
-          <w:szCs w:val="24"/>
-        </w:rPr>
-        <w:t>Outrossim, a construção da rede PPI permitiu identificar 24 genes interagentes dentre os 29 DEGs, organizados em dois módulos biológicos distintos. Cinco GDEs não participaram da rede por ausência de interações proteína-proteína acima do limiar de confiança adotado: RXRG (log2FC = 5,28; FDR = 3,26e-149), DIO1 (log2FC = -2,60; FDR = 2,44e-27), MED13 (log2FC = 1,20; FDR = 1,43e-76), TBC1D4 (log2FC = -1,63; FDR = 2,06e-94) e PFKFB2 (log2FC = -1,09; FDR = 4,48e-40). O módulo 1 foi composto por PRKCA (log2FC = -1,02; FDR = 5,97e-38), PRKCG (log2FC = -1,05; FDR = 1,92e-30), PLCG1 (log2FC = -1,43; FDR = 5,77e-141), PLCD3 (log2FC = 2,38; FDR = 1,19e-95), PLCD4 (log2FC = -1,53; FDR = 2,89e-71) e PIK3R2 (log2FC = 1,34; FDR = 1,80e-14), formando uma rede densamente conectada associada a componentes centrais da transdução de sinais intracelulares. E, por sua vez, o módulo 2 foi constituído por ACTG1 (log2FC = 1,41; FDR = 1,72e-119) e ITGAV (log2FC = 1,03; FDR = 3,52e-55), apresentando menor conectividade e ligação indireta com o módulo principal.</w:t>
+          <w:b w:val="0"/>
+          <w:i w:val="false"/>
+          <w:sz w:val="24"/>
+          <w:szCs w:val="24"/>
+        </w:rPr>
+        <w:t>A construção da rede PPI permitiu identificar 24 genes interagentes dentre os 29 DEGs, organizados em dois módulos biológicos distintos. Cinco GDEs não participaram da rede por ausência de interações proteína-proteína acima do limiar de confiança adotado: RXRG (log2FC = 5,28; FDR = 3,26e-149), DIO1 (log2FC = -2,60; FDR = 2,44e-27), MED13 (log2FC = 1,20; FDR = 1,43e-76), TBC1D4 (log2FC = -1,63; FDR = 2,06e-94) e PFKFB2 (log2FC = -1,09; FDR = 4,48e-40). O módulo 1 foi composto por PRKCA (log2FC = -1,02; FDR = 5,97e-38), PRKCG (log2FC = -1,05; FDR = 1,92e-30), PLCG1 (log2FC = -1,43; FDR = 5,77e-141), PLCD3 (log2FC = 2,38; FDR = 1,19e-95), PLCD4 (log2FC = -1,53; FDR = 2,89e-71) e PIK3R2 (log2FC = 1,34; FDR = 1,80e-14), constituindo uma rede densamente conectada e associada a componentes centrais da transdução de sinais intracelulares. O módulo 2, por sua vez, foi constituído por ACTG1 (log2FC = 1,41; FDR = 1,72e-119) e ITGAV (log2FC = 1,03; FDR = 3,52e-55), apresentando menor conectividade e ligação indireta com o módulo principal.</w:t>
       </w:r>
     </w:p>
     <w:p>
@@ -851,7 +851,7 @@
           <w:sz w:val="24"/>
           <w:szCs w:val="24"/>
         </w:rPr>
-        <w:t>No contexto da topologia da rede, PRKCA destacou-se como o gene de maior centralidade, apresentando grau 5, betweenness de 0,476, closeness de 8,52x10-4 e hub score de 1,000. A conexao entre os dois modulos foi estabelecida exclusivamente pela interacao PRKCA-ACTG1 (escore STRING = 918), conferindo a PRKCA uma posicao topologica singular como unico elo entre a sinalizacao intracelular mediada por fosfolipases C e proteinas quinase C (Modulo 1) e a organizacao estrutural do citoesqueleto de actina e das interacoes celula-matriz (Modulo 2). PLCG1, PLCD4 e PRKCG tambem apresentaram elevada conectividade (grau = 4), embora restrita ao Modulo 1, reforcando a coesao funcional desse agrupamento. Ressalta-se que essas metricas de centralidade sao exploratorias e derivadas de uma rede de 8 nos, devendo ser interpretadas como geradoras de hipoteses, e nao como evidencia de relevancia funcional comprovada.</w:t>
+        <w:t>No que se refere à topologia da rede, PRKCA destacou-se como o gene de maior centralidade, apresentando grau 5, betweenness de 0,476, closeness de 8,52×10⁻⁴ e hub score de 1,000. A conexão entre os dois módulos foi estabelecida exclusivamente pela interação PRKCA-ACTG1 (escore STRING = 918), conferindo a PRKCA uma posição topológica singular como único elo entre a sinalização intracelular mediada por fosfolipases C e proteínas quinase C (Módulo 1) e a organização estrutural do citoesqueleto de actina e das interações célula-matriz (Módulo 2). PLCG1, PLCD4 e PRKCG também apresentaram elevada conectividade (grau = 4), embora restrita ao Módulo 1, reforçando a coesão funcional desse agrupamento. Ressalta-se que essas métricas de centralidade são exploratórias e derivadas de uma rede de 8 nós, devendo ser interpretadas como geradoras de hipóteses, e não como evidência de relevância funcional comprovada.</w:t>
       </w:r>
     </w:p>
     <w:p>
@@ -874,7 +874,7 @@
           <w:sz w:val="24"/>
           <w:szCs w:val="24"/>
         </w:rPr>
-        <w:t>Por outro lado, 21 dos 29 GDEs nao integraram a rede conectada final, incluindo genes de alta significancia estatistica como MYH7, DIO3, CCND1, RXRG e ATP2A1. Esses genes, embora nao apresentem interacoes de alta confianca (escore &gt;= 700) entre si na base STRING, possuem relevancia biologica individual documentada na literatura. Tal achado sugere que as alteracoes transcriptomicas na via SHT no carcinoma de tireoide podem envolver tanto mecanismos coordenados de sinalizacao intracelular representados pela rede PPI quanto mecanismos independentes exercidos por genes que atuam por vias distintas ou que interagem por meio de proteinas nao capturadas pelos limiares de confianca adotados. A investigacao desses genes em estudos futuros, com estrategias complementares de analise de redes e validacao experimental, podera ampliar a compreensao dos processos moleculares associados a biologia tumoral tireoidiana.</w:t>
+        <w:t>Em contrapartida, 21 dos 29 GDEs não integraram a rede conectada final, incluindo genes de alta significância estatística como MYH7, DIO3, CCND1, RXRG e ATP2A1. Embora esses genes não apresentem interações de alta confiança (escore ≥ 700) entre si na base STRING, possuem relevância biológica individual documentada na literatura. Tal achado sugere que as alterações transcriptômicas na via SHT no carcinoma de tireoide podem envolver tanto mecanismos coordenados de sinalização intracelular, representados pela rede PPI, quanto mecanismos independentes exercidos por genes que atuam por vias distintas ou que interagem por meio de proteínas não capturadas pelos limiares de confiança adotados. A investigação desses genes em estudos futuros, com estratégias complementares de análise de redes e validação experimental, poderá ampliar a compreensão dos processos moleculares associados à biologia tumoral tireoidiana.</w:t>
       </w:r>
     </w:p>
     <w:p>
@@ -1053,12 +1053,12 @@
       <w:r>
         <w:rPr>
           <w:rFonts w:eastAsia="Times New Roman" w:cs="Times New Roman" w:ascii="Times New Roman" w:hAnsi="Times New Roman"/>
-          <w:b w:val="false"/>
-          <w:i w:val="false"/>
-          <w:sz w:val="24"/>
-          <w:szCs w:val="24"/>
-        </w:rPr>
-        <w:t>Agradecemos a Escola Tecnica Estadual Joao Barcelos Martins e ao Instituto Federal Fluminense de Educacao, Ciencia e Tecnologia Campus Campos Guarus pela promocao dessa troca sinergica.</w:t>
+          <w:b w:val="0"/>
+          <w:i w:val="false"/>
+          <w:sz w:val="24"/>
+          <w:szCs w:val="24"/>
+        </w:rPr>
+        <w:t>Agradecemos à Escola Técnica Estadual João Barcelos Martins e ao Instituto Federal Fluminense de Educação, Ciência e Tecnologia Campus Campos Guarus pela promoção dessa troca sinérgica.</w:t>
       </w:r>
     </w:p>
     <w:p>

</xml_diff>